<commit_message>
Change to canvas description, and new mini manual
</commit_message>
<xml_diff>
--- a/docs/dataPARC-Assistant-Mini-Guide.docx
+++ b/docs/dataPARC-Assistant-Mini-Guide.docx
@@ -1,13 +1,13 @@
 
 <file path=word/document.xml><?xml version="1.0" encoding="utf-8"?>
-<w:document xmlns:wpc="http://schemas.microsoft.com/office/word/2010/wordprocessingCanvas" xmlns:mc="http://schemas.openxmlformats.org/markup-compatibility/2006" xmlns:o="urn:schemas-microsoft-com:office:office" xmlns:r="http://schemas.openxmlformats.org/officeDocument/2006/relationships" xmlns:m="http://schemas.openxmlformats.org/officeDocument/2006/math" xmlns:v="urn:schemas-microsoft-com:vml" xmlns:wp14="http://schemas.microsoft.com/office/word/2010/wordprocessingDrawing" xmlns:wp="http://schemas.openxmlformats.org/drawingml/2006/wordprocessingDrawing" xmlns:w10="urn:schemas-microsoft-com:office:word" xmlns:w="http://schemas.openxmlformats.org/wordprocessingml/2006/main" xmlns:w14="http://schemas.microsoft.com/office/word/2010/wordml" xmlns:w15="http://schemas.microsoft.com/office/word/2012/wordml" xmlns:wpg="http://schemas.microsoft.com/office/word/2010/wordprocessingGroup" xmlns:wpi="http://schemas.microsoft.com/office/word/2010/wordprocessingInk" xmlns:wne="http://schemas.microsoft.com/office/word/2006/wordml" xmlns:wps="http://schemas.microsoft.com/office/word/2010/wordprocessingShape" xmlns:cx="http://schemas.microsoft.com/office/drawing/2014/chartex" xmlns:cx1="http://schemas.microsoft.com/office/drawing/2015/9/8/chartex" xmlns:cx2="http://schemas.microsoft.com/office/drawing/2015/10/21/chartex" xmlns:cx3="http://schemas.microsoft.com/office/drawing/2016/5/9/chartex" xmlns:cx4="http://schemas.microsoft.com/office/drawing/2016/5/10/chartex" xmlns:cx5="http://schemas.microsoft.com/office/drawing/2016/5/11/chartex" xmlns:cx6="http://schemas.microsoft.com/office/drawing/2016/5/12/chartex" xmlns:cx7="http://schemas.microsoft.com/office/drawing/2016/5/13/chartex" xmlns:cx8="http://schemas.microsoft.com/office/drawing/2016/5/14/chartex" xmlns:aink="http://schemas.microsoft.com/office/drawing/2016/ink" xmlns:am3d="http://schemas.microsoft.com/office/drawing/2017/model3d" xmlns:w16cex="http://schemas.microsoft.com/office/word/2018/wordml/cex" xmlns:w16cid="http://schemas.microsoft.com/office/word/2016/wordml/cid" xmlns:w16="http://schemas.microsoft.com/office/word/2018/wordml" xmlns:w16sdtdh="http://schemas.microsoft.com/office/word/2020/wordml/sdtdatahash" xmlns:w16se="http://schemas.microsoft.com/office/word/2015/wordml/symex" mc:Ignorable="w14 w15 wp14">
+<w:document xmlns:wpc="http://schemas.microsoft.com/office/word/2010/wordprocessingCanvas" xmlns:cx="http://schemas.microsoft.com/office/drawing/2014/chartex" xmlns:cx1="http://schemas.microsoft.com/office/drawing/2015/9/8/chartex" xmlns:cx2="http://schemas.microsoft.com/office/drawing/2015/10/21/chartex" xmlns:cx3="http://schemas.microsoft.com/office/drawing/2016/5/9/chartex" xmlns:cx4="http://schemas.microsoft.com/office/drawing/2016/5/10/chartex" xmlns:cx5="http://schemas.microsoft.com/office/drawing/2016/5/11/chartex" xmlns:cx6="http://schemas.microsoft.com/office/drawing/2016/5/12/chartex" xmlns:cx7="http://schemas.microsoft.com/office/drawing/2016/5/13/chartex" xmlns:cx8="http://schemas.microsoft.com/office/drawing/2016/5/14/chartex" xmlns:mc="http://schemas.openxmlformats.org/markup-compatibility/2006" xmlns:aink="http://schemas.microsoft.com/office/drawing/2016/ink" xmlns:am3d="http://schemas.microsoft.com/office/drawing/2017/model3d" xmlns:o="urn:schemas-microsoft-com:office:office" xmlns:oel="http://schemas.microsoft.com/office/2019/extlst" xmlns:r="http://schemas.openxmlformats.org/officeDocument/2006/relationships" xmlns:m="http://schemas.openxmlformats.org/officeDocument/2006/math" xmlns:v="urn:schemas-microsoft-com:vml" xmlns:wp14="http://schemas.microsoft.com/office/word/2010/wordprocessingDrawing" xmlns:wp="http://schemas.openxmlformats.org/drawingml/2006/wordprocessingDrawing" xmlns:w10="urn:schemas-microsoft-com:office:word" xmlns:w="http://schemas.openxmlformats.org/wordprocessingml/2006/main" xmlns:w14="http://schemas.microsoft.com/office/word/2010/wordml" xmlns:w15="http://schemas.microsoft.com/office/word/2012/wordml" xmlns:w16cex="http://schemas.microsoft.com/office/word/2018/wordml/cex" xmlns:w16cid="http://schemas.microsoft.com/office/word/2016/wordml/cid" xmlns:w16="http://schemas.microsoft.com/office/word/2018/wordml" xmlns:w16du="http://schemas.microsoft.com/office/word/2023/wordml/word16du" xmlns:w16sdtdh="http://schemas.microsoft.com/office/word/2020/wordml/sdtdatahash" xmlns:w16sdtfl="http://schemas.microsoft.com/office/word/2024/wordml/sdtformatlock" xmlns:w16se="http://schemas.microsoft.com/office/word/2015/wordml/symex" xmlns:wpg="http://schemas.microsoft.com/office/word/2010/wordprocessingGroup" xmlns:wpi="http://schemas.microsoft.com/office/word/2010/wordprocessingInk" xmlns:wne="http://schemas.microsoft.com/office/word/2006/wordml" xmlns:wps="http://schemas.microsoft.com/office/word/2010/wordprocessingShape" mc:Ignorable="w14 w15 w16se w16cid w16 w16cex w16sdtdh w16sdtfl w16du wp14">
   <w:body>
     <w:p>
       <w:pPr>
         <w:pStyle w:val="Heading1"/>
       </w:pPr>
       <w:r>
-        <w:t xml:space="preserve">dataPARC Assistant Interactive Mockup</w:t>
+        <w:t>dataPARC Assistant Interactive Mockup</w:t>
       </w:r>
     </w:p>
     <w:p>
@@ -15,7 +15,7 @@
         <w:pStyle w:val="Heading2"/>
       </w:pPr>
       <w:r>
-        <w:t xml:space="preserve">Mini User Guide</w:t>
+        <w:t>Mini User Guide</w:t>
       </w:r>
     </w:p>
     <w:p>
@@ -40,7 +40,7 @@
         <w:t xml:space="preserve">Last Updated: </w:t>
       </w:r>
       <w:r>
-        <w:t xml:space="preserve">January 2026</w:t>
+        <w:t>January 2026</w:t>
       </w:r>
     </w:p>
     <w:p>
@@ -48,7 +48,7 @@
         <w:pStyle w:val="Heading2"/>
       </w:pPr>
       <w:r>
-        <w:t xml:space="preserve">What Is This?</w:t>
+        <w:t>What Is This?</w:t>
       </w:r>
     </w:p>
     <w:p>
@@ -60,7 +60,7 @@
           <w:b/>
           <w:bCs/>
         </w:rPr>
-        <w:t xml:space="preserve">dataPARC Assistant Enhanced Mockup</w:t>
+        <w:t>dataPARC Assistant Enhanced Mockup</w:t>
       </w:r>
       <w:r>
         <w:t xml:space="preserve"> is an interactive HTML prototype demonstrating an AI-powered chat assistant for industrial process control. It shows how an intelligent assistant could help plant operators, process engineers, and maintenance technicians gain insights from process data.</w:t>
@@ -75,7 +75,7 @@
         <w:t xml:space="preserve">Key Concept: </w:t>
       </w:r>
       <w:r>
-        <w:t xml:space="preserve">The assistant's personality is modeled after an experienced shift supervisor with 15+ years of process industry experience - professional, precise, and proactive.</w:t>
+        <w:t>The assistant's personality is modeled after an experienced shift supervisor with 15+ years of process industry experience - professional, precise, and proactive.</w:t>
       </w:r>
     </w:p>
     <w:p>
@@ -90,7 +90,7 @@
         <w:t xml:space="preserve">Important: </w:t>
       </w:r>
       <w:r>
-        <w:t xml:space="preserve">This is a static prototype with pre-scripted responses. It demonstrates visual design and interaction patterns but does not connect to real dataPARC data or use live AI.</w:t>
+        <w:t>This is a static prototype with pre-scripted responses. It demonstrates visual design and interaction patterns but does not connect to real dataPARC data or use live AI.</w:t>
       </w:r>
     </w:p>
     <w:p>
@@ -98,7 +98,7 @@
         <w:pStyle w:val="Heading2"/>
       </w:pPr>
       <w:r>
-        <w:t xml:space="preserve">Core Design Principles</w:t>
+        <w:t>Core Design Principles</w:t>
       </w:r>
     </w:p>
     <w:p>
@@ -106,12 +106,12 @@
         <w:pStyle w:val="Heading3"/>
       </w:pPr>
       <w:r>
-        <w:t xml:space="preserve">1. Context Awareness</w:t>
-      </w:r>
-    </w:p>
-    <w:p>
-      <w:r>
-        <w:t xml:space="preserve">The assistant adapts through four operational modes:</w:t>
+        <w:t>1. Context Awareness</w:t>
+      </w:r>
+    </w:p>
+    <w:p>
+      <w:r>
+        <w:t>The assistant adapts through four operational modes:</w:t>
       </w:r>
     </w:p>
     <w:p>
@@ -130,7 +130,7 @@
         <w:t xml:space="preserve">Normal Operations: </w:t>
       </w:r>
       <w:r>
-        <w:t xml:space="preserve">Proactive monitoring with contextual suggestions</w:t>
+        <w:t>Proactive monitoring with contextual suggestions</w:t>
       </w:r>
     </w:p>
     <w:p>
@@ -149,7 +149,7 @@
         <w:t xml:space="preserve">Critical Alert: </w:t>
       </w:r>
       <w:r>
-        <w:t xml:space="preserve">Urgent but calm presentation of safety-critical information</w:t>
+        <w:t>Urgent but calm presentation of safety-critical information</w:t>
       </w:r>
     </w:p>
     <w:p>
@@ -168,7 +168,7 @@
         <w:t xml:space="preserve">Root Cause Analysis: </w:t>
       </w:r>
       <w:r>
-        <w:t xml:space="preserve">Structured, evidence-based incident investigation</w:t>
+        <w:t>Structured, evidence-based incident investigation</w:t>
       </w:r>
     </w:p>
     <w:p>
@@ -187,7 +187,7 @@
         <w:t xml:space="preserve">Idle Mode: </w:t>
       </w:r>
       <w:r>
-        <w:t xml:space="preserve">Helpful suggestions for common tasks</w:t>
+        <w:t>Helpful suggestions for common tasks</w:t>
       </w:r>
     </w:p>
     <w:p>
@@ -195,12 +195,17 @@
         <w:pStyle w:val="Heading3"/>
       </w:pPr>
       <w:r>
-        <w:t xml:space="preserve">2. Information Hierarchy</w:t>
-      </w:r>
-    </w:p>
-    <w:p>
-      <w:r>
-        <w:t xml:space="preserve">Critical information first, with progressive disclosure:</w:t>
+        <w:t>2. Information Hierarchy</w:t>
+      </w:r>
+    </w:p>
+    <w:p>
+      <w:proofErr w:type="gramStart"/>
+      <w:r>
+        <w:t>Critical</w:t>
+      </w:r>
+      <w:proofErr w:type="gramEnd"/>
+      <w:r>
+        <w:t xml:space="preserve"> information first, with progressive disclosure:</w:t>
       </w:r>
     </w:p>
     <w:p>
@@ -212,7 +217,7 @@
         </w:numPr>
       </w:pPr>
       <w:r>
-        <w:t xml:space="preserve">Direct answers and key metrics (always visible)</w:t>
+        <w:t>Direct answers and key metrics (always visible)</w:t>
       </w:r>
     </w:p>
     <w:p>
@@ -224,7 +229,7 @@
         </w:numPr>
       </w:pPr>
       <w:r>
-        <w:t xml:space="preserve">Supporting data and correlations (immediately visible)</w:t>
+        <w:t>Supporting data and correlations (immediately visible)</w:t>
       </w:r>
     </w:p>
     <w:p>
@@ -236,7 +241,7 @@
         </w:numPr>
       </w:pPr>
       <w:r>
-        <w:t xml:space="preserve">Reasoning and methodology (expandable sections)</w:t>
+        <w:t>Reasoning and methodology (expandable sections)</w:t>
       </w:r>
     </w:p>
     <w:p>
@@ -248,7 +253,7 @@
         </w:numPr>
       </w:pPr>
       <w:r>
-        <w:t xml:space="preserve">Data sources and metadata (collapsible sections)</w:t>
+        <w:t>Data sources and metadata (collapsible sections)</w:t>
       </w:r>
     </w:p>
     <w:p>
@@ -256,7 +261,7 @@
         <w:pStyle w:val="Heading3"/>
       </w:pPr>
       <w:r>
-        <w:t xml:space="preserve">3. Visual Alert Severity</w:t>
+        <w:t>3. Visual Alert Severity</w:t>
       </w:r>
     </w:p>
     <w:p>
@@ -275,7 +280,7 @@
         <w:t xml:space="preserve">Critical Alerts: </w:t>
       </w:r>
       <w:r>
-        <w:t xml:space="preserve">Red gradient banner with animation</w:t>
+        <w:t>Red gradient banner with animation</w:t>
       </w:r>
     </w:p>
     <w:p>
@@ -294,7 +299,7 @@
         <w:t xml:space="preserve">Normal Messages: </w:t>
       </w:r>
       <w:r>
-        <w:t xml:space="preserve">Purple accent with subtle styling</w:t>
+        <w:t>Purple accent with subtle styling</w:t>
       </w:r>
     </w:p>
     <w:p>
@@ -313,7 +318,7 @@
         <w:t xml:space="preserve">User Messages: </w:t>
       </w:r>
       <w:r>
-        <w:t xml:space="preserve">Blue background for clear identification</w:t>
+        <w:t>Blue background for clear identification</w:t>
       </w:r>
     </w:p>
     <w:p>
@@ -321,12 +326,12 @@
         <w:pStyle w:val="Heading3"/>
       </w:pPr>
       <w:r>
-        <w:t xml:space="preserve">4. Data Transparency</w:t>
-      </w:r>
-    </w:p>
-    <w:p>
-      <w:r>
-        <w:t xml:space="preserve">All insights include specific data source tags, expandable reasoning sections, clear timestamps, and explicit confidence levels.</w:t>
+        <w:t>4. Data Transparency</w:t>
+      </w:r>
+    </w:p>
+    <w:p>
+      <w:r>
+        <w:t>All insights include specific data source tags, expandable reasoning sections, clear timestamps, and explicit confidence levels.</w:t>
       </w:r>
     </w:p>
     <w:p>
@@ -334,7 +339,7 @@
         <w:pStyle w:val="Heading3"/>
       </w:pPr>
       <w:r>
-        <w:t xml:space="preserve">5. Respectful Collaboration</w:t>
+        <w:t>5. Respectful Collaboration</w:t>
       </w:r>
     </w:p>
     <w:p>
@@ -342,7 +347,7 @@
         <w:spacing w:after="200"/>
       </w:pPr>
       <w:r>
-        <w:t xml:space="preserve">Uses "I recommend" rather than "You must"; presents options without forcing choices; acknowledges user expertise.</w:t>
+        <w:t>Uses "I recommend" rather than "You must"; presents options without forcing choices; acknowledges user expertise.</w:t>
       </w:r>
     </w:p>
     <w:p>
@@ -350,7 +355,8 @@
         <w:pStyle w:val="Heading2"/>
       </w:pPr>
       <w:r>
-        <w:t xml:space="preserve">Quick Start Guide</w:t>
+        <w:lastRenderedPageBreak/>
+        <w:t>Quick Start Guide</w:t>
       </w:r>
     </w:p>
     <w:p>
@@ -358,7 +364,7 @@
         <w:pStyle w:val="Heading3"/>
       </w:pPr>
       <w:r>
-        <w:t xml:space="preserve">Opening the Mockup</w:t>
+        <w:t>Opening the Mockup</w:t>
       </w:r>
     </w:p>
     <w:p>
@@ -374,9 +380,9 @@
       </w:r>
       <w:r>
         <w:rPr>
-          <w:rFonts w:ascii="Courier New" w:cs="Courier New" w:eastAsia="Courier New" w:hAnsi="Courier New"/>
-        </w:rPr>
-        <w:t xml:space="preserve">dataparc-assistant-mockup-enhanced_1-0.html</w:t>
+          <w:rFonts w:ascii="Courier New" w:eastAsia="Courier New" w:hAnsi="Courier New" w:cs="Courier New"/>
+        </w:rPr>
+        <w:t>dataparc-assistant-mockup-enhanced_1-0.html</w:t>
       </w:r>
       <w:r>
         <w:t xml:space="preserve"> in any modern browser</w:t>
@@ -408,7 +414,7 @@
         <w:t xml:space="preserve">Right pane: </w:t>
       </w:r>
       <w:r>
-        <w:t xml:space="preserve">AI Assistant chat panel</w:t>
+        <w:t>AI Assistant chat panel</w:t>
       </w:r>
     </w:p>
     <w:p>
@@ -416,7 +422,7 @@
         <w:pStyle w:val="Heading3"/>
       </w:pPr>
       <w:r>
-        <w:t xml:space="preserve">Exploring the Four Modes</w:t>
+        <w:t>Exploring the Four Modes</w:t>
       </w:r>
     </w:p>
     <w:p>
@@ -428,7 +434,7 @@
           <w:b/>
           <w:bCs/>
         </w:rPr>
-        <w:t xml:space="preserve">Demo Mode</w:t>
+        <w:t>Demo Mode</w:t>
       </w:r>
       <w:r>
         <w:t xml:space="preserve"> dropdown (top-right) to switch between scenarios:</w:t>
@@ -450,7 +456,7 @@
         <w:t xml:space="preserve">Normal Operations: </w:t>
       </w:r>
       <w:r>
-        <w:t xml:space="preserve">Proactive monitoring, temperature excursions pattern, contextual suggestions</w:t>
+        <w:t>Proactive monitoring, temperature excursions pattern, contextual suggestions</w:t>
       </w:r>
     </w:p>
     <w:p>
@@ -469,7 +475,7 @@
         <w:t xml:space="preserve">Critical Alert: </w:t>
       </w:r>
       <w:r>
-        <w:t xml:space="preserve">Red banner with 158 PSI (limit: 150 PSI), +2 PSI/min, trajectory prediction</w:t>
+        <w:t>Red banner with 158 PSI (limit: 150 PSI), +2 PSI/min, trajectory prediction</w:t>
       </w:r>
     </w:p>
     <w:p>
@@ -488,7 +494,7 @@
         <w:t xml:space="preserve">Root Cause Analysis: </w:t>
       </w:r>
       <w:r>
-        <w:t xml:space="preserve">Timeline visualization, contributing factors with confidence badges</w:t>
+        <w:t>Timeline visualization, contributing factors with confidence badges</w:t>
       </w:r>
     </w:p>
     <w:p>
@@ -507,7 +513,7 @@
         <w:t xml:space="preserve">Idle / Smart Suggestions: </w:t>
       </w:r>
       <w:r>
-        <w:t xml:space="preserve">Common task suggestions (click to populate input field)</w:t>
+        <w:t>Common task suggestions (click to populate input field)</w:t>
       </w:r>
     </w:p>
     <w:p>
@@ -515,7 +521,7 @@
         <w:pStyle w:val="Heading3"/>
       </w:pPr>
       <w:r>
-        <w:t xml:space="preserve">Interactive Elements</w:t>
+        <w:t>Interactive Elements</w:t>
       </w:r>
     </w:p>
     <w:p>
@@ -527,7 +533,7 @@
         <w:t xml:space="preserve">Typing Questions: </w:t>
       </w:r>
       <w:r>
-        <w:t xml:space="preserve">Click input field → Type question → Press Enter. Try "What caused the spike?" (triggers detailed analysis).</w:t>
+        <w:t>Click input field → Type question → Press Enter. Try "What caused the spike?" (triggers detailed analysis).</w:t>
       </w:r>
     </w:p>
     <w:p>
@@ -539,7 +545,7 @@
         <w:t xml:space="preserve">Expandable Sections: </w:t>
       </w:r>
       <w:r>
-        <w:t xml:space="preserve">Click "▶ Show reasoning" or "▶ Data Sources Used" to expand/collapse.</w:t>
+        <w:t>Click "▶ Show reasoning" or "▶ Data Sources Used" to expand/collapse.</w:t>
       </w:r>
     </w:p>
     <w:p>
@@ -554,7 +560,7 @@
         <w:t xml:space="preserve">Visual Indicators: </w:t>
       </w:r>
       <w:r>
-        <w:t xml:space="preserve">Mode badge (bottom-left), context bar (below header), confidence badges (green), icons (🤖 Assistant, 👤 User).</w:t>
+        <w:t>Mode badge (bottom-left), context bar (below header), confidence badges (green), icons (🤖 Assistant, 👤 User).</w:t>
       </w:r>
     </w:p>
     <w:p>
@@ -562,7 +568,7 @@
         <w:pStyle w:val="Heading2"/>
       </w:pPr>
       <w:r>
-        <w:t xml:space="preserve">Technical Overview</w:t>
+        <w:t>Technical Overview</w:t>
       </w:r>
     </w:p>
     <w:p>
@@ -574,7 +580,7 @@
         <w:t xml:space="preserve">Browser Compatibility: </w:t>
       </w:r>
       <w:r>
-        <w:t xml:space="preserve">Chrome/Edge (recommended), Firefox, Safari. Not supported: Internet Explorer.</w:t>
+        <w:t>Chrome/Edge (recommended), Firefox, Safari. Not supported: Internet Explorer.</w:t>
       </w:r>
     </w:p>
     <w:p>
@@ -586,7 +592,7 @@
         <w:t xml:space="preserve">File Structure: </w:t>
       </w:r>
       <w:r>
-        <w:t xml:space="preserve">Single self-contained HTML file (~60KB). Inline CSS and React components. No external dependencies except CDN-hosted React 18.</w:t>
+        <w:t>Single self-contained HTML file (~60KB). Inline CSS and React components. No external dependencies except CDN-hosted React 18.</w:t>
       </w:r>
     </w:p>
     <w:p>
@@ -601,7 +607,7 @@
         <w:t xml:space="preserve">Limitations: </w:t>
       </w:r>
       <w:r>
-        <w:t xml:space="preserve">No real AI/LLM integration, no dataPARC data connections, no authentication, no data persistence, desktop-only (no responsive mobile design), no accessibility features.</w:t>
+        <w:t>No real AI/LLM integration, no dataPARC data connections, no authentication, no data persistence, desktop-only (no responsive mobile design), no accessibility features.</w:t>
       </w:r>
     </w:p>
     <w:p>
@@ -609,43 +615,48 @@
         <w:pStyle w:val="Heading2"/>
       </w:pPr>
       <w:r>
-        <w:t xml:space="preserve">Quick Reference</w:t>
+        <w:t>Quick Reference</w:t>
       </w:r>
     </w:p>
     <w:tbl>
       <w:tblPr>
-        <w:tblW w:type="pct" w:w="100%"/>
+        <w:tblW w:w="5000" w:type="pct"/>
         <w:tblBorders>
-          <w:top w:val="single" w:color="auto" w:sz="4"/>
-          <w:left w:val="single" w:color="auto" w:sz="4"/>
-          <w:bottom w:val="single" w:color="auto" w:sz="4"/>
-          <w:right w:val="single" w:color="auto" w:sz="4"/>
-          <w:insideH w:val="single" w:color="auto" w:sz="4"/>
-          <w:insideV w:val="single" w:color="auto" w:sz="4"/>
+          <w:top w:val="single" w:sz="4" w:space="0" w:color="auto"/>
+          <w:left w:val="single" w:sz="4" w:space="0" w:color="auto"/>
+          <w:bottom w:val="single" w:sz="4" w:space="0" w:color="auto"/>
+          <w:right w:val="single" w:sz="4" w:space="0" w:color="auto"/>
+          <w:insideH w:val="single" w:sz="4" w:space="0" w:color="auto"/>
+          <w:insideV w:val="single" w:sz="4" w:space="0" w:color="auto"/>
         </w:tblBorders>
+        <w:tblCellMar>
+          <w:left w:w="10" w:type="dxa"/>
+          <w:right w:w="10" w:type="dxa"/>
+        </w:tblCellMar>
+        <w:tblLook w:val="04A0" w:firstRow="1" w:lastRow="0" w:firstColumn="1" w:lastColumn="0" w:noHBand="0" w:noVBand="1"/>
       </w:tblPr>
       <w:tblGrid>
         <w:gridCol w:w="2000"/>
         <w:gridCol w:w="1800"/>
-        <w:gridCol w:w="2880"/>
-        <w:gridCol w:w="2680"/>
+        <w:gridCol w:w="2879"/>
+        <w:gridCol w:w="2679"/>
       </w:tblGrid>
       <w:tr>
         <w:tc>
           <w:tcPr>
-            <w:tcW w:type="dxa" w:w="2000"/>
+            <w:tcW w:w="2000" w:type="dxa"/>
             <w:tcBorders>
-              <w:top w:val="single" w:color="CCCCCC" w:sz="1"/>
-              <w:left w:val="single" w:color="CCCCCC" w:sz="1"/>
-              <w:bottom w:val="single" w:color="CCCCCC" w:sz="1"/>
-              <w:right w:val="single" w:color="CCCCCC" w:sz="1"/>
+              <w:top w:val="single" w:sz="1" w:space="0" w:color="CCCCCC"/>
+              <w:left w:val="single" w:sz="1" w:space="0" w:color="CCCCCC"/>
+              <w:bottom w:val="single" w:sz="1" w:space="0" w:color="CCCCCC"/>
+              <w:right w:val="single" w:sz="1" w:space="0" w:color="CCCCCC"/>
             </w:tcBorders>
-            <w:shd w:fill="2E5C8A" w:val="clear"/>
+            <w:shd w:val="clear" w:color="auto" w:fill="2E5C8A"/>
             <w:tcMar>
-              <w:top w:type="dxa" w:w="60"/>
-              <w:left w:type="dxa" w:w="100"/>
-              <w:bottom w:type="dxa" w:w="60"/>
-              <w:right w:type="dxa" w:w="100"/>
+              <w:top w:w="60" w:type="dxa"/>
+              <w:left w:w="100" w:type="dxa"/>
+              <w:bottom w:w="60" w:type="dxa"/>
+              <w:right w:w="100" w:type="dxa"/>
             </w:tcMar>
           </w:tcPr>
           <w:p>
@@ -657,25 +668,25 @@
                 <w:sz w:val="20"/>
                 <w:szCs w:val="20"/>
               </w:rPr>
-              <w:t xml:space="preserve">Mode</w:t>
+              <w:t>Mode</w:t>
             </w:r>
           </w:p>
         </w:tc>
         <w:tc>
           <w:tcPr>
-            <w:tcW w:type="dxa" w:w="1800"/>
+            <w:tcW w:w="1800" w:type="dxa"/>
             <w:tcBorders>
-              <w:top w:val="single" w:color="CCCCCC" w:sz="1"/>
-              <w:left w:val="single" w:color="CCCCCC" w:sz="1"/>
-              <w:bottom w:val="single" w:color="CCCCCC" w:sz="1"/>
-              <w:right w:val="single" w:color="CCCCCC" w:sz="1"/>
+              <w:top w:val="single" w:sz="1" w:space="0" w:color="CCCCCC"/>
+              <w:left w:val="single" w:sz="1" w:space="0" w:color="CCCCCC"/>
+              <w:bottom w:val="single" w:sz="1" w:space="0" w:color="CCCCCC"/>
+              <w:right w:val="single" w:sz="1" w:space="0" w:color="CCCCCC"/>
             </w:tcBorders>
-            <w:shd w:fill="2E5C8A" w:val="clear"/>
+            <w:shd w:val="clear" w:color="auto" w:fill="2E5C8A"/>
             <w:tcMar>
-              <w:top w:type="dxa" w:w="60"/>
-              <w:left w:type="dxa" w:w="100"/>
-              <w:bottom w:type="dxa" w:w="60"/>
-              <w:right w:type="dxa" w:w="100"/>
+              <w:top w:w="60" w:type="dxa"/>
+              <w:left w:w="100" w:type="dxa"/>
+              <w:bottom w:w="60" w:type="dxa"/>
+              <w:right w:w="100" w:type="dxa"/>
             </w:tcMar>
           </w:tcPr>
           <w:p>
@@ -687,25 +698,25 @@
                 <w:sz w:val="20"/>
                 <w:szCs w:val="20"/>
               </w:rPr>
-              <w:t xml:space="preserve">Color</w:t>
+              <w:t>Color</w:t>
             </w:r>
           </w:p>
         </w:tc>
         <w:tc>
           <w:tcPr>
-            <w:tcW w:type="dxa" w:w="2880"/>
+            <w:tcW w:w="2880" w:type="dxa"/>
             <w:tcBorders>
-              <w:top w:val="single" w:color="CCCCCC" w:sz="1"/>
-              <w:left w:val="single" w:color="CCCCCC" w:sz="1"/>
-              <w:bottom w:val="single" w:color="CCCCCC" w:sz="1"/>
-              <w:right w:val="single" w:color="CCCCCC" w:sz="1"/>
+              <w:top w:val="single" w:sz="1" w:space="0" w:color="CCCCCC"/>
+              <w:left w:val="single" w:sz="1" w:space="0" w:color="CCCCCC"/>
+              <w:bottom w:val="single" w:sz="1" w:space="0" w:color="CCCCCC"/>
+              <w:right w:val="single" w:sz="1" w:space="0" w:color="CCCCCC"/>
             </w:tcBorders>
-            <w:shd w:fill="2E5C8A" w:val="clear"/>
+            <w:shd w:val="clear" w:color="auto" w:fill="2E5C8A"/>
             <w:tcMar>
-              <w:top w:type="dxa" w:w="60"/>
-              <w:left w:type="dxa" w:w="100"/>
-              <w:bottom w:type="dxa" w:w="60"/>
-              <w:right w:type="dxa" w:w="100"/>
+              <w:top w:w="60" w:type="dxa"/>
+              <w:left w:w="100" w:type="dxa"/>
+              <w:bottom w:w="60" w:type="dxa"/>
+              <w:right w:w="100" w:type="dxa"/>
             </w:tcMar>
           </w:tcPr>
           <w:p>
@@ -717,25 +728,25 @@
                 <w:sz w:val="20"/>
                 <w:szCs w:val="20"/>
               </w:rPr>
-              <w:t xml:space="preserve">Purpose</w:t>
+              <w:t>Purpose</w:t>
             </w:r>
           </w:p>
         </w:tc>
         <w:tc>
           <w:tcPr>
-            <w:tcW w:type="dxa" w:w="2680"/>
+            <w:tcW w:w="2680" w:type="dxa"/>
             <w:tcBorders>
-              <w:top w:val="single" w:color="CCCCCC" w:sz="1"/>
-              <w:left w:val="single" w:color="CCCCCC" w:sz="1"/>
-              <w:bottom w:val="single" w:color="CCCCCC" w:sz="1"/>
-              <w:right w:val="single" w:color="CCCCCC" w:sz="1"/>
+              <w:top w:val="single" w:sz="1" w:space="0" w:color="CCCCCC"/>
+              <w:left w:val="single" w:sz="1" w:space="0" w:color="CCCCCC"/>
+              <w:bottom w:val="single" w:sz="1" w:space="0" w:color="CCCCCC"/>
+              <w:right w:val="single" w:sz="1" w:space="0" w:color="CCCCCC"/>
             </w:tcBorders>
-            <w:shd w:fill="2E5C8A" w:val="clear"/>
+            <w:shd w:val="clear" w:color="auto" w:fill="2E5C8A"/>
             <w:tcMar>
-              <w:top w:type="dxa" w:w="60"/>
-              <w:left w:type="dxa" w:w="100"/>
-              <w:bottom w:type="dxa" w:w="60"/>
-              <w:right w:type="dxa" w:w="100"/>
+              <w:top w:w="60" w:type="dxa"/>
+              <w:left w:w="100" w:type="dxa"/>
+              <w:bottom w:w="60" w:type="dxa"/>
+              <w:right w:w="100" w:type="dxa"/>
             </w:tcMar>
           </w:tcPr>
           <w:p>
@@ -747,7 +758,7 @@
                 <w:sz w:val="20"/>
                 <w:szCs w:val="20"/>
               </w:rPr>
-              <w:t xml:space="preserve">Key Feature</w:t>
+              <w:t>Key Feature</w:t>
             </w:r>
           </w:p>
         </w:tc>
@@ -755,18 +766,18 @@
       <w:tr>
         <w:tc>
           <w:tcPr>
-            <w:tcW w:type="dxa" w:w="2000"/>
+            <w:tcW w:w="2000" w:type="dxa"/>
             <w:tcBorders>
-              <w:top w:val="single" w:color="CCCCCC" w:sz="1"/>
-              <w:left w:val="single" w:color="CCCCCC" w:sz="1"/>
-              <w:bottom w:val="single" w:color="CCCCCC" w:sz="1"/>
-              <w:right w:val="single" w:color="CCCCCC" w:sz="1"/>
+              <w:top w:val="single" w:sz="1" w:space="0" w:color="CCCCCC"/>
+              <w:left w:val="single" w:sz="1" w:space="0" w:color="CCCCCC"/>
+              <w:bottom w:val="single" w:sz="1" w:space="0" w:color="CCCCCC"/>
+              <w:right w:val="single" w:sz="1" w:space="0" w:color="CCCCCC"/>
             </w:tcBorders>
             <w:tcMar>
-              <w:top w:type="dxa" w:w="60"/>
-              <w:left w:type="dxa" w:w="100"/>
-              <w:bottom w:type="dxa" w:w="60"/>
-              <w:right w:type="dxa" w:w="100"/>
+              <w:top w:w="60" w:type="dxa"/>
+              <w:left w:w="100" w:type="dxa"/>
+              <w:bottom w:w="60" w:type="dxa"/>
+              <w:right w:w="100" w:type="dxa"/>
             </w:tcMar>
           </w:tcPr>
           <w:p>
@@ -775,24 +786,24 @@
                 <w:sz w:val="20"/>
                 <w:szCs w:val="20"/>
               </w:rPr>
-              <w:t xml:space="preserve">Normal Operations</w:t>
+              <w:t>Normal Operations</w:t>
             </w:r>
           </w:p>
         </w:tc>
         <w:tc>
           <w:tcPr>
-            <w:tcW w:type="dxa" w:w="1800"/>
+            <w:tcW w:w="1800" w:type="dxa"/>
             <w:tcBorders>
-              <w:top w:val="single" w:color="CCCCCC" w:sz="1"/>
-              <w:left w:val="single" w:color="CCCCCC" w:sz="1"/>
-              <w:bottom w:val="single" w:color="CCCCCC" w:sz="1"/>
-              <w:right w:val="single" w:color="CCCCCC" w:sz="1"/>
+              <w:top w:val="single" w:sz="1" w:space="0" w:color="CCCCCC"/>
+              <w:left w:val="single" w:sz="1" w:space="0" w:color="CCCCCC"/>
+              <w:bottom w:val="single" w:sz="1" w:space="0" w:color="CCCCCC"/>
+              <w:right w:val="single" w:sz="1" w:space="0" w:color="CCCCCC"/>
             </w:tcBorders>
             <w:tcMar>
-              <w:top w:type="dxa" w:w="60"/>
-              <w:left w:type="dxa" w:w="100"/>
-              <w:bottom w:type="dxa" w:w="60"/>
-              <w:right w:type="dxa" w:w="100"/>
+              <w:top w:w="60" w:type="dxa"/>
+              <w:left w:w="100" w:type="dxa"/>
+              <w:bottom w:w="60" w:type="dxa"/>
+              <w:right w:w="100" w:type="dxa"/>
             </w:tcMar>
           </w:tcPr>
           <w:p>
@@ -801,24 +812,24 @@
                 <w:sz w:val="20"/>
                 <w:szCs w:val="20"/>
               </w:rPr>
-              <w:t xml:space="preserve">Purple</w:t>
+              <w:t>Purple</w:t>
             </w:r>
           </w:p>
         </w:tc>
         <w:tc>
           <w:tcPr>
-            <w:tcW w:type="dxa" w:w="2880"/>
+            <w:tcW w:w="2880" w:type="dxa"/>
             <w:tcBorders>
-              <w:top w:val="single" w:color="CCCCCC" w:sz="1"/>
-              <w:left w:val="single" w:color="CCCCCC" w:sz="1"/>
-              <w:bottom w:val="single" w:color="CCCCCC" w:sz="1"/>
-              <w:right w:val="single" w:color="CCCCCC" w:sz="1"/>
+              <w:top w:val="single" w:sz="1" w:space="0" w:color="CCCCCC"/>
+              <w:left w:val="single" w:sz="1" w:space="0" w:color="CCCCCC"/>
+              <w:bottom w:val="single" w:sz="1" w:space="0" w:color="CCCCCC"/>
+              <w:right w:val="single" w:sz="1" w:space="0" w:color="CCCCCC"/>
             </w:tcBorders>
             <w:tcMar>
-              <w:top w:type="dxa" w:w="60"/>
-              <w:left w:type="dxa" w:w="100"/>
-              <w:bottom w:type="dxa" w:w="60"/>
-              <w:right w:type="dxa" w:w="100"/>
+              <w:top w:w="60" w:type="dxa"/>
+              <w:left w:w="100" w:type="dxa"/>
+              <w:bottom w:w="60" w:type="dxa"/>
+              <w:right w:w="100" w:type="dxa"/>
             </w:tcMar>
           </w:tcPr>
           <w:p>
@@ -827,24 +838,24 @@
                 <w:sz w:val="20"/>
                 <w:szCs w:val="20"/>
               </w:rPr>
-              <w:t xml:space="preserve">Proactive monitoring</w:t>
+              <w:t>Proactive monitoring</w:t>
             </w:r>
           </w:p>
         </w:tc>
         <w:tc>
           <w:tcPr>
-            <w:tcW w:type="dxa" w:w="2680"/>
+            <w:tcW w:w="2680" w:type="dxa"/>
             <w:tcBorders>
-              <w:top w:val="single" w:color="CCCCCC" w:sz="1"/>
-              <w:left w:val="single" w:color="CCCCCC" w:sz="1"/>
-              <w:bottom w:val="single" w:color="CCCCCC" w:sz="1"/>
-              <w:right w:val="single" w:color="CCCCCC" w:sz="1"/>
+              <w:top w:val="single" w:sz="1" w:space="0" w:color="CCCCCC"/>
+              <w:left w:val="single" w:sz="1" w:space="0" w:color="CCCCCC"/>
+              <w:bottom w:val="single" w:sz="1" w:space="0" w:color="CCCCCC"/>
+              <w:right w:val="single" w:sz="1" w:space="0" w:color="CCCCCC"/>
             </w:tcBorders>
             <w:tcMar>
-              <w:top w:type="dxa" w:w="60"/>
-              <w:left w:type="dxa" w:w="100"/>
-              <w:bottom w:type="dxa" w:w="60"/>
-              <w:right w:type="dxa" w:w="100"/>
+              <w:top w:w="60" w:type="dxa"/>
+              <w:left w:w="100" w:type="dxa"/>
+              <w:bottom w:w="60" w:type="dxa"/>
+              <w:right w:w="100" w:type="dxa"/>
             </w:tcMar>
           </w:tcPr>
           <w:p>
@@ -853,7 +864,7 @@
                 <w:sz w:val="20"/>
                 <w:szCs w:val="20"/>
               </w:rPr>
-              <w:t xml:space="preserve">Contextual suggestions</w:t>
+              <w:t>Contextual suggestions</w:t>
             </w:r>
           </w:p>
         </w:tc>
@@ -861,18 +872,18 @@
       <w:tr>
         <w:tc>
           <w:tcPr>
-            <w:tcW w:type="dxa" w:w="2000"/>
+            <w:tcW w:w="2000" w:type="dxa"/>
             <w:tcBorders>
-              <w:top w:val="single" w:color="CCCCCC" w:sz="1"/>
-              <w:left w:val="single" w:color="CCCCCC" w:sz="1"/>
-              <w:bottom w:val="single" w:color="CCCCCC" w:sz="1"/>
-              <w:right w:val="single" w:color="CCCCCC" w:sz="1"/>
+              <w:top w:val="single" w:sz="1" w:space="0" w:color="CCCCCC"/>
+              <w:left w:val="single" w:sz="1" w:space="0" w:color="CCCCCC"/>
+              <w:bottom w:val="single" w:sz="1" w:space="0" w:color="CCCCCC"/>
+              <w:right w:val="single" w:sz="1" w:space="0" w:color="CCCCCC"/>
             </w:tcBorders>
             <w:tcMar>
-              <w:top w:type="dxa" w:w="60"/>
-              <w:left w:type="dxa" w:w="100"/>
-              <w:bottom w:type="dxa" w:w="60"/>
-              <w:right w:type="dxa" w:w="100"/>
+              <w:top w:w="60" w:type="dxa"/>
+              <w:left w:w="100" w:type="dxa"/>
+              <w:bottom w:w="60" w:type="dxa"/>
+              <w:right w:w="100" w:type="dxa"/>
             </w:tcMar>
           </w:tcPr>
           <w:p>
@@ -881,24 +892,24 @@
                 <w:sz w:val="20"/>
                 <w:szCs w:val="20"/>
               </w:rPr>
-              <w:t xml:space="preserve">Critical Alert</w:t>
+              <w:t>Critical Alert</w:t>
             </w:r>
           </w:p>
         </w:tc>
         <w:tc>
           <w:tcPr>
-            <w:tcW w:type="dxa" w:w="1800"/>
+            <w:tcW w:w="1800" w:type="dxa"/>
             <w:tcBorders>
-              <w:top w:val="single" w:color="CCCCCC" w:sz="1"/>
-              <w:left w:val="single" w:color="CCCCCC" w:sz="1"/>
-              <w:bottom w:val="single" w:color="CCCCCC" w:sz="1"/>
-              <w:right w:val="single" w:color="CCCCCC" w:sz="1"/>
+              <w:top w:val="single" w:sz="1" w:space="0" w:color="CCCCCC"/>
+              <w:left w:val="single" w:sz="1" w:space="0" w:color="CCCCCC"/>
+              <w:bottom w:val="single" w:sz="1" w:space="0" w:color="CCCCCC"/>
+              <w:right w:val="single" w:sz="1" w:space="0" w:color="CCCCCC"/>
             </w:tcBorders>
             <w:tcMar>
-              <w:top w:type="dxa" w:w="60"/>
-              <w:left w:type="dxa" w:w="100"/>
-              <w:bottom w:type="dxa" w:w="60"/>
-              <w:right w:type="dxa" w:w="100"/>
+              <w:top w:w="60" w:type="dxa"/>
+              <w:left w:w="100" w:type="dxa"/>
+              <w:bottom w:w="60" w:type="dxa"/>
+              <w:right w:w="100" w:type="dxa"/>
             </w:tcMar>
           </w:tcPr>
           <w:p>
@@ -907,24 +918,24 @@
                 <w:sz w:val="20"/>
                 <w:szCs w:val="20"/>
               </w:rPr>
-              <w:t xml:space="preserve">Red</w:t>
+              <w:t>Red</w:t>
             </w:r>
           </w:p>
         </w:tc>
         <w:tc>
           <w:tcPr>
-            <w:tcW w:type="dxa" w:w="2880"/>
+            <w:tcW w:w="2880" w:type="dxa"/>
             <w:tcBorders>
-              <w:top w:val="single" w:color="CCCCCC" w:sz="1"/>
-              <w:left w:val="single" w:color="CCCCCC" w:sz="1"/>
-              <w:bottom w:val="single" w:color="CCCCCC" w:sz="1"/>
-              <w:right w:val="single" w:color="CCCCCC" w:sz="1"/>
+              <w:top w:val="single" w:sz="1" w:space="0" w:color="CCCCCC"/>
+              <w:left w:val="single" w:sz="1" w:space="0" w:color="CCCCCC"/>
+              <w:bottom w:val="single" w:sz="1" w:space="0" w:color="CCCCCC"/>
+              <w:right w:val="single" w:sz="1" w:space="0" w:color="CCCCCC"/>
             </w:tcBorders>
             <w:tcMar>
-              <w:top w:type="dxa" w:w="60"/>
-              <w:left w:type="dxa" w:w="100"/>
-              <w:bottom w:type="dxa" w:w="60"/>
-              <w:right w:type="dxa" w:w="100"/>
+              <w:top w:w="60" w:type="dxa"/>
+              <w:left w:w="100" w:type="dxa"/>
+              <w:bottom w:w="60" w:type="dxa"/>
+              <w:right w:w="100" w:type="dxa"/>
             </w:tcMar>
           </w:tcPr>
           <w:p>
@@ -933,24 +944,24 @@
                 <w:sz w:val="20"/>
                 <w:szCs w:val="20"/>
               </w:rPr>
-              <w:t xml:space="preserve">Emergency notification</w:t>
+              <w:t>Emergency notification</w:t>
             </w:r>
           </w:p>
         </w:tc>
         <w:tc>
           <w:tcPr>
-            <w:tcW w:type="dxa" w:w="2680"/>
+            <w:tcW w:w="2680" w:type="dxa"/>
             <w:tcBorders>
-              <w:top w:val="single" w:color="CCCCCC" w:sz="1"/>
-              <w:left w:val="single" w:color="CCCCCC" w:sz="1"/>
-              <w:bottom w:val="single" w:color="CCCCCC" w:sz="1"/>
-              <w:right w:val="single" w:color="CCCCCC" w:sz="1"/>
+              <w:top w:val="single" w:sz="1" w:space="0" w:color="CCCCCC"/>
+              <w:left w:val="single" w:sz="1" w:space="0" w:color="CCCCCC"/>
+              <w:bottom w:val="single" w:sz="1" w:space="0" w:color="CCCCCC"/>
+              <w:right w:val="single" w:sz="1" w:space="0" w:color="CCCCCC"/>
             </w:tcBorders>
             <w:tcMar>
-              <w:top w:type="dxa" w:w="60"/>
-              <w:left w:type="dxa" w:w="100"/>
-              <w:bottom w:type="dxa" w:w="60"/>
-              <w:right w:type="dxa" w:w="100"/>
+              <w:top w:w="60" w:type="dxa"/>
+              <w:left w:w="100" w:type="dxa"/>
+              <w:bottom w:w="60" w:type="dxa"/>
+              <w:right w:w="100" w:type="dxa"/>
             </w:tcMar>
           </w:tcPr>
           <w:p>
@@ -959,7 +970,7 @@
                 <w:sz w:val="20"/>
                 <w:szCs w:val="20"/>
               </w:rPr>
-              <w:t xml:space="preserve">Structured alert data</w:t>
+              <w:t>Structured alert data</w:t>
             </w:r>
           </w:p>
         </w:tc>
@@ -967,18 +978,18 @@
       <w:tr>
         <w:tc>
           <w:tcPr>
-            <w:tcW w:type="dxa" w:w="2000"/>
+            <w:tcW w:w="2000" w:type="dxa"/>
             <w:tcBorders>
-              <w:top w:val="single" w:color="CCCCCC" w:sz="1"/>
-              <w:left w:val="single" w:color="CCCCCC" w:sz="1"/>
-              <w:bottom w:val="single" w:color="CCCCCC" w:sz="1"/>
-              <w:right w:val="single" w:color="CCCCCC" w:sz="1"/>
+              <w:top w:val="single" w:sz="1" w:space="0" w:color="CCCCCC"/>
+              <w:left w:val="single" w:sz="1" w:space="0" w:color="CCCCCC"/>
+              <w:bottom w:val="single" w:sz="1" w:space="0" w:color="CCCCCC"/>
+              <w:right w:val="single" w:sz="1" w:space="0" w:color="CCCCCC"/>
             </w:tcBorders>
             <w:tcMar>
-              <w:top w:type="dxa" w:w="60"/>
-              <w:left w:type="dxa" w:w="100"/>
-              <w:bottom w:type="dxa" w:w="60"/>
-              <w:right w:type="dxa" w:w="100"/>
+              <w:top w:w="60" w:type="dxa"/>
+              <w:left w:w="100" w:type="dxa"/>
+              <w:bottom w:w="60" w:type="dxa"/>
+              <w:right w:w="100" w:type="dxa"/>
             </w:tcMar>
           </w:tcPr>
           <w:p>
@@ -987,24 +998,24 @@
                 <w:sz w:val="20"/>
                 <w:szCs w:val="20"/>
               </w:rPr>
-              <w:t xml:space="preserve">Root Cause Analysis</w:t>
+              <w:t>Root Cause Analysis</w:t>
             </w:r>
           </w:p>
         </w:tc>
         <w:tc>
           <w:tcPr>
-            <w:tcW w:type="dxa" w:w="1800"/>
+            <w:tcW w:w="1800" w:type="dxa"/>
             <w:tcBorders>
-              <w:top w:val="single" w:color="CCCCCC" w:sz="1"/>
-              <w:left w:val="single" w:color="CCCCCC" w:sz="1"/>
-              <w:bottom w:val="single" w:color="CCCCCC" w:sz="1"/>
-              <w:right w:val="single" w:color="CCCCCC" w:sz="1"/>
+              <w:top w:val="single" w:sz="1" w:space="0" w:color="CCCCCC"/>
+              <w:left w:val="single" w:sz="1" w:space="0" w:color="CCCCCC"/>
+              <w:bottom w:val="single" w:sz="1" w:space="0" w:color="CCCCCC"/>
+              <w:right w:val="single" w:sz="1" w:space="0" w:color="CCCCCC"/>
             </w:tcBorders>
             <w:tcMar>
-              <w:top w:type="dxa" w:w="60"/>
-              <w:left w:type="dxa" w:w="100"/>
-              <w:bottom w:type="dxa" w:w="60"/>
-              <w:right w:type="dxa" w:w="100"/>
+              <w:top w:w="60" w:type="dxa"/>
+              <w:left w:w="100" w:type="dxa"/>
+              <w:bottom w:w="60" w:type="dxa"/>
+              <w:right w:w="100" w:type="dxa"/>
             </w:tcMar>
           </w:tcPr>
           <w:p>
@@ -1013,24 +1024,24 @@
                 <w:sz w:val="20"/>
                 <w:szCs w:val="20"/>
               </w:rPr>
-              <w:t xml:space="preserve">Purple</w:t>
+              <w:t>Purple</w:t>
             </w:r>
           </w:p>
         </w:tc>
         <w:tc>
           <w:tcPr>
-            <w:tcW w:type="dxa" w:w="2880"/>
+            <w:tcW w:w="2880" w:type="dxa"/>
             <w:tcBorders>
-              <w:top w:val="single" w:color="CCCCCC" w:sz="1"/>
-              <w:left w:val="single" w:color="CCCCCC" w:sz="1"/>
-              <w:bottom w:val="single" w:color="CCCCCC" w:sz="1"/>
-              <w:right w:val="single" w:color="CCCCCC" w:sz="1"/>
+              <w:top w:val="single" w:sz="1" w:space="0" w:color="CCCCCC"/>
+              <w:left w:val="single" w:sz="1" w:space="0" w:color="CCCCCC"/>
+              <w:bottom w:val="single" w:sz="1" w:space="0" w:color="CCCCCC"/>
+              <w:right w:val="single" w:sz="1" w:space="0" w:color="CCCCCC"/>
             </w:tcBorders>
             <w:tcMar>
-              <w:top w:type="dxa" w:w="60"/>
-              <w:left w:type="dxa" w:w="100"/>
-              <w:bottom w:type="dxa" w:w="60"/>
-              <w:right w:type="dxa" w:w="100"/>
+              <w:top w:w="60" w:type="dxa"/>
+              <w:left w:w="100" w:type="dxa"/>
+              <w:bottom w:w="60" w:type="dxa"/>
+              <w:right w:w="100" w:type="dxa"/>
             </w:tcMar>
           </w:tcPr>
           <w:p>
@@ -1039,24 +1050,24 @@
                 <w:sz w:val="20"/>
                 <w:szCs w:val="20"/>
               </w:rPr>
-              <w:t xml:space="preserve">Post-incident investigation</w:t>
+              <w:t>Post-incident investigation</w:t>
             </w:r>
           </w:p>
         </w:tc>
         <w:tc>
           <w:tcPr>
-            <w:tcW w:type="dxa" w:w="2680"/>
+            <w:tcW w:w="2680" w:type="dxa"/>
             <w:tcBorders>
-              <w:top w:val="single" w:color="CCCCCC" w:sz="1"/>
-              <w:left w:val="single" w:color="CCCCCC" w:sz="1"/>
-              <w:bottom w:val="single" w:color="CCCCCC" w:sz="1"/>
-              <w:right w:val="single" w:color="CCCCCC" w:sz="1"/>
+              <w:top w:val="single" w:sz="1" w:space="0" w:color="CCCCCC"/>
+              <w:left w:val="single" w:sz="1" w:space="0" w:color="CCCCCC"/>
+              <w:bottom w:val="single" w:sz="1" w:space="0" w:color="CCCCCC"/>
+              <w:right w:val="single" w:sz="1" w:space="0" w:color="CCCCCC"/>
             </w:tcBorders>
             <w:tcMar>
-              <w:top w:type="dxa" w:w="60"/>
-              <w:left w:type="dxa" w:w="100"/>
-              <w:bottom w:type="dxa" w:w="60"/>
-              <w:right w:type="dxa" w:w="100"/>
+              <w:top w:w="60" w:type="dxa"/>
+              <w:left w:w="100" w:type="dxa"/>
+              <w:bottom w:w="60" w:type="dxa"/>
+              <w:right w:w="100" w:type="dxa"/>
             </w:tcMar>
           </w:tcPr>
           <w:p>
@@ -1065,7 +1076,7 @@
                 <w:sz w:val="20"/>
                 <w:szCs w:val="20"/>
               </w:rPr>
-              <w:t xml:space="preserve">Timeline visualization</w:t>
+              <w:t>Timeline visualization</w:t>
             </w:r>
           </w:p>
         </w:tc>
@@ -1073,18 +1084,18 @@
       <w:tr>
         <w:tc>
           <w:tcPr>
-            <w:tcW w:type="dxa" w:w="2000"/>
+            <w:tcW w:w="2000" w:type="dxa"/>
             <w:tcBorders>
-              <w:top w:val="single" w:color="CCCCCC" w:sz="1"/>
-              <w:left w:val="single" w:color="CCCCCC" w:sz="1"/>
-              <w:bottom w:val="single" w:color="CCCCCC" w:sz="1"/>
-              <w:right w:val="single" w:color="CCCCCC" w:sz="1"/>
+              <w:top w:val="single" w:sz="1" w:space="0" w:color="CCCCCC"/>
+              <w:left w:val="single" w:sz="1" w:space="0" w:color="CCCCCC"/>
+              <w:bottom w:val="single" w:sz="1" w:space="0" w:color="CCCCCC"/>
+              <w:right w:val="single" w:sz="1" w:space="0" w:color="CCCCCC"/>
             </w:tcBorders>
             <w:tcMar>
-              <w:top w:type="dxa" w:w="60"/>
-              <w:left w:type="dxa" w:w="100"/>
-              <w:bottom w:type="dxa" w:w="60"/>
-              <w:right w:type="dxa" w:w="100"/>
+              <w:top w:w="60" w:type="dxa"/>
+              <w:left w:w="100" w:type="dxa"/>
+              <w:bottom w:w="60" w:type="dxa"/>
+              <w:right w:w="100" w:type="dxa"/>
             </w:tcMar>
           </w:tcPr>
           <w:p>
@@ -1093,24 +1104,24 @@
                 <w:sz w:val="20"/>
                 <w:szCs w:val="20"/>
               </w:rPr>
-              <w:t xml:space="preserve">Idle</w:t>
+              <w:t>Idle</w:t>
             </w:r>
           </w:p>
         </w:tc>
         <w:tc>
           <w:tcPr>
-            <w:tcW w:type="dxa" w:w="1800"/>
+            <w:tcW w:w="1800" w:type="dxa"/>
             <w:tcBorders>
-              <w:top w:val="single" w:color="CCCCCC" w:sz="1"/>
-              <w:left w:val="single" w:color="CCCCCC" w:sz="1"/>
-              <w:bottom w:val="single" w:color="CCCCCC" w:sz="1"/>
-              <w:right w:val="single" w:color="CCCCCC" w:sz="1"/>
+              <w:top w:val="single" w:sz="1" w:space="0" w:color="CCCCCC"/>
+              <w:left w:val="single" w:sz="1" w:space="0" w:color="CCCCCC"/>
+              <w:bottom w:val="single" w:sz="1" w:space="0" w:color="CCCCCC"/>
+              <w:right w:val="single" w:sz="1" w:space="0" w:color="CCCCCC"/>
             </w:tcBorders>
             <w:tcMar>
-              <w:top w:type="dxa" w:w="60"/>
-              <w:left w:type="dxa" w:w="100"/>
-              <w:bottom w:type="dxa" w:w="60"/>
-              <w:right w:type="dxa" w:w="100"/>
+              <w:top w:w="60" w:type="dxa"/>
+              <w:left w:w="100" w:type="dxa"/>
+              <w:bottom w:w="60" w:type="dxa"/>
+              <w:right w:w="100" w:type="dxa"/>
             </w:tcMar>
           </w:tcPr>
           <w:p>
@@ -1119,24 +1130,24 @@
                 <w:sz w:val="20"/>
                 <w:szCs w:val="20"/>
               </w:rPr>
-              <w:t xml:space="preserve">Gray</w:t>
+              <w:t>Gray</w:t>
             </w:r>
           </w:p>
         </w:tc>
         <w:tc>
           <w:tcPr>
-            <w:tcW w:type="dxa" w:w="2880"/>
+            <w:tcW w:w="2880" w:type="dxa"/>
             <w:tcBorders>
-              <w:top w:val="single" w:color="CCCCCC" w:sz="1"/>
-              <w:left w:val="single" w:color="CCCCCC" w:sz="1"/>
-              <w:bottom w:val="single" w:color="CCCCCC" w:sz="1"/>
-              <w:right w:val="single" w:color="CCCCCC" w:sz="1"/>
+              <w:top w:val="single" w:sz="1" w:space="0" w:color="CCCCCC"/>
+              <w:left w:val="single" w:sz="1" w:space="0" w:color="CCCCCC"/>
+              <w:bottom w:val="single" w:sz="1" w:space="0" w:color="CCCCCC"/>
+              <w:right w:val="single" w:sz="1" w:space="0" w:color="CCCCCC"/>
             </w:tcBorders>
             <w:tcMar>
-              <w:top w:type="dxa" w:w="60"/>
-              <w:left w:type="dxa" w:w="100"/>
-              <w:bottom w:type="dxa" w:w="60"/>
-              <w:right w:type="dxa" w:w="100"/>
+              <w:top w:w="60" w:type="dxa"/>
+              <w:left w:w="100" w:type="dxa"/>
+              <w:bottom w:w="60" w:type="dxa"/>
+              <w:right w:w="100" w:type="dxa"/>
             </w:tcMar>
           </w:tcPr>
           <w:p>
@@ -1145,24 +1156,24 @@
                 <w:sz w:val="20"/>
                 <w:szCs w:val="20"/>
               </w:rPr>
-              <w:t xml:space="preserve">Task discovery</w:t>
+              <w:t>Task discovery</w:t>
             </w:r>
           </w:p>
         </w:tc>
         <w:tc>
           <w:tcPr>
-            <w:tcW w:type="dxa" w:w="2680"/>
+            <w:tcW w:w="2680" w:type="dxa"/>
             <w:tcBorders>
-              <w:top w:val="single" w:color="CCCCCC" w:sz="1"/>
-              <w:left w:val="single" w:color="CCCCCC" w:sz="1"/>
-              <w:bottom w:val="single" w:color="CCCCCC" w:sz="1"/>
-              <w:right w:val="single" w:color="CCCCCC" w:sz="1"/>
+              <w:top w:val="single" w:sz="1" w:space="0" w:color="CCCCCC"/>
+              <w:left w:val="single" w:sz="1" w:space="0" w:color="CCCCCC"/>
+              <w:bottom w:val="single" w:sz="1" w:space="0" w:color="CCCCCC"/>
+              <w:right w:val="single" w:sz="1" w:space="0" w:color="CCCCCC"/>
             </w:tcBorders>
             <w:tcMar>
-              <w:top w:type="dxa" w:w="60"/>
-              <w:left w:type="dxa" w:w="100"/>
-              <w:bottom w:type="dxa" w:w="60"/>
-              <w:right w:type="dxa" w:w="100"/>
+              <w:top w:w="60" w:type="dxa"/>
+              <w:left w:w="100" w:type="dxa"/>
+              <w:bottom w:w="60" w:type="dxa"/>
+              <w:right w:w="100" w:type="dxa"/>
             </w:tcMar>
           </w:tcPr>
           <w:p>
@@ -1171,7 +1182,7 @@
                 <w:sz w:val="20"/>
                 <w:szCs w:val="20"/>
               </w:rPr>
-              <w:t xml:space="preserve">Task suggestions</w:t>
+              <w:t>Task suggestions</w:t>
             </w:r>
           </w:p>
         </w:tc>
@@ -1187,7 +1198,7 @@
         <w:pStyle w:val="Heading3"/>
       </w:pPr>
       <w:r>
-        <w:t xml:space="preserve">Design Color Palette</w:t>
+        <w:t>Design Color Palette</w:t>
       </w:r>
     </w:p>
     <w:p>
@@ -1199,6 +1210,7 @@
           <w:b/>
           <w:bCs/>
         </w:rPr>
+        <w:lastRenderedPageBreak/>
         <w:t xml:space="preserve">Primary (Assistant): </w:t>
       </w:r>
       <w:r>
@@ -1232,7 +1244,7 @@
         <w:t xml:space="preserve">Context: </w:t>
       </w:r>
       <w:r>
-        <w:t xml:space="preserve">#0369a1</w:t>
+        <w:t>#0369a1</w:t>
       </w:r>
     </w:p>
     <w:p>
@@ -1240,12 +1252,12 @@
         <w:pStyle w:val="Heading3"/>
       </w:pPr>
       <w:r>
-        <w:t xml:space="preserve">Next Steps for Production</w:t>
-      </w:r>
-    </w:p>
-    <w:p>
-      <w:r>
-        <w:t xml:space="preserve">Backend integration • AI/LLM service • Data analysis engine • User authentication • Responsive design • Accessibility • Testing</w:t>
+        <w:t>Next Steps for Production</w:t>
+      </w:r>
+    </w:p>
+    <w:p>
+      <w:r>
+        <w:t>Backend integration • AI/LLM service • Data analysis engine • User authentication • Responsive design • Accessibility • Testing</w:t>
       </w:r>
     </w:p>
     <w:p>
@@ -1261,7 +1273,7 @@
         <w:rPr>
           <w:color w:val="CCCCCC"/>
         </w:rPr>
-        <w:t xml:space="preserve">_______________________________________________________________________________</w:t>
+        <w:t>_______________________________________________________________________________</w:t>
       </w:r>
     </w:p>
     <w:p>
@@ -1275,36 +1287,432 @@
           <w:sz w:val="20"/>
           <w:szCs w:val="20"/>
         </w:rPr>
-        <w:t xml:space="preserve">This guide describes version 1.0 of the dataPARC Assistant Enhanced Mockup</w:t>
+        <w:t>This guide describes version 1.0 of the dataPARC Assistant Enhanced Mockup</w:t>
       </w:r>
     </w:p>
     <w:sectPr>
-      <w:pgSz w:w="12240" w:h="15840" w:orient="portrait"/>
+      <w:footerReference w:type="even" r:id="rId7"/>
+      <w:footerReference w:type="default" r:id="rId8"/>
+      <w:footerReference w:type="first" r:id="rId9"/>
+      <w:pgSz w:w="12240" w:h="15840"/>
       <w:pgMar w:top="1440" w:right="1440" w:bottom="1440" w:left="1440" w:header="708" w:footer="708" w:gutter="0"/>
-      <w:pgNumType/>
+      <w:cols w:space="720"/>
       <w:docGrid w:linePitch="360"/>
     </w:sectPr>
   </w:body>
 </w:document>
 </file>
 
-<file path=word/comments.xml><?xml version="1.0" encoding="utf-8"?>
-<w:comments xmlns:cx="http://schemas.microsoft.com/office/drawing/2014/chartex" xmlns:cx1="http://schemas.microsoft.com/office/drawing/2015/9/8/chartex" xmlns:cx2="http://schemas.microsoft.com/office/drawing/2015/10/21/chartex" xmlns:cx3="http://schemas.microsoft.com/office/drawing/2016/5/9/chartex" xmlns:cx4="http://schemas.microsoft.com/office/drawing/2016/5/10/chartex" xmlns:cx5="http://schemas.microsoft.com/office/drawing/2016/5/11/chartex" xmlns:cx6="http://schemas.microsoft.com/office/drawing/2016/5/12/chartex" xmlns:cx7="http://schemas.microsoft.com/office/drawing/2016/5/13/chartex" xmlns:cx8="http://schemas.microsoft.com/office/drawing/2016/5/14/chartex" xmlns:mc="http://schemas.openxmlformats.org/markup-compatibility/2006" xmlns:aink="http://schemas.microsoft.com/office/drawing/2016/ink" xmlns:am3d="http://schemas.microsoft.com/office/drawing/2017/model3d" xmlns:o="urn:schemas-microsoft-com:office:office" xmlns:r="http://schemas.openxmlformats.org/officeDocument/2006/relationships" xmlns:m="http://schemas.openxmlformats.org/officeDocument/2006/math" xmlns:v="urn:schemas-microsoft-com:vml" xmlns:wp14="http://schemas.microsoft.com/office/word/2010/wordprocessingDrawing" xmlns:wp="http://schemas.openxmlformats.org/drawingml/2006/wordprocessingDrawing" xmlns:w10="urn:schemas-microsoft-com:office:word" xmlns:w="http://schemas.openxmlformats.org/wordprocessingml/2006/main" xmlns:w14="http://schemas.microsoft.com/office/word/2010/wordml" xmlns:w15="http://schemas.microsoft.com/office/word/2012/wordml" xmlns:w16cex="http://schemas.microsoft.com/office/word/2018/wordml/cex" xmlns:w16cid="http://schemas.microsoft.com/office/word/2016/wordml/cid" xmlns:w16="http://schemas.microsoft.com/office/word/2018/wordml" xmlns:w16sdtdh="http://schemas.microsoft.com/office/word/2020/wordml/sdtdatahash" xmlns:w16se="http://schemas.microsoft.com/office/word/2015/wordml/symex" xmlns:wpg="http://schemas.microsoft.com/office/word/2010/wordprocessingGroup" xmlns:wpi="http://schemas.microsoft.com/office/word/2010/wordprocessingInk" xmlns:wne="http://schemas.microsoft.com/office/word/2006/wordml" xmlns:wps="http://schemas.microsoft.com/office/word/2010/wordprocessingShape"/>
+<file path=word/endnotes.xml><?xml version="1.0" encoding="utf-8"?>
+<w:endnotes xmlns:wpc="http://schemas.microsoft.com/office/word/2010/wordprocessingCanvas" xmlns:cx="http://schemas.microsoft.com/office/drawing/2014/chartex" xmlns:cx1="http://schemas.microsoft.com/office/drawing/2015/9/8/chartex" xmlns:cx2="http://schemas.microsoft.com/office/drawing/2015/10/21/chartex" xmlns:cx3="http://schemas.microsoft.com/office/drawing/2016/5/9/chartex" xmlns:cx4="http://schemas.microsoft.com/office/drawing/2016/5/10/chartex" xmlns:cx5="http://schemas.microsoft.com/office/drawing/2016/5/11/chartex" xmlns:cx6="http://schemas.microsoft.com/office/drawing/2016/5/12/chartex" xmlns:cx7="http://schemas.microsoft.com/office/drawing/2016/5/13/chartex" xmlns:cx8="http://schemas.microsoft.com/office/drawing/2016/5/14/chartex" xmlns:mc="http://schemas.openxmlformats.org/markup-compatibility/2006" xmlns:aink="http://schemas.microsoft.com/office/drawing/2016/ink" xmlns:am3d="http://schemas.microsoft.com/office/drawing/2017/model3d" xmlns:o="urn:schemas-microsoft-com:office:office" xmlns:oel="http://schemas.microsoft.com/office/2019/extlst" xmlns:r="http://schemas.openxmlformats.org/officeDocument/2006/relationships" xmlns:m="http://schemas.openxmlformats.org/officeDocument/2006/math" xmlns:v="urn:schemas-microsoft-com:vml" xmlns:wp14="http://schemas.microsoft.com/office/word/2010/wordprocessingDrawing" xmlns:wp="http://schemas.openxmlformats.org/drawingml/2006/wordprocessingDrawing" xmlns:w10="urn:schemas-microsoft-com:office:word" xmlns:w="http://schemas.openxmlformats.org/wordprocessingml/2006/main" xmlns:w14="http://schemas.microsoft.com/office/word/2010/wordml" xmlns:w15="http://schemas.microsoft.com/office/word/2012/wordml" xmlns:w16cex="http://schemas.microsoft.com/office/word/2018/wordml/cex" xmlns:w16cid="http://schemas.microsoft.com/office/word/2016/wordml/cid" xmlns:w16="http://schemas.microsoft.com/office/word/2018/wordml" xmlns:w16du="http://schemas.microsoft.com/office/word/2023/wordml/word16du" xmlns:w16sdtdh="http://schemas.microsoft.com/office/word/2020/wordml/sdtdatahash" xmlns:w16sdtfl="http://schemas.microsoft.com/office/word/2024/wordml/sdtformatlock" xmlns:w16se="http://schemas.microsoft.com/office/word/2015/wordml/symex" xmlns:wpg="http://schemas.microsoft.com/office/word/2010/wordprocessingGroup" xmlns:wpi="http://schemas.microsoft.com/office/word/2010/wordprocessingInk" xmlns:wne="http://schemas.microsoft.com/office/word/2006/wordml" xmlns:wps="http://schemas.microsoft.com/office/word/2010/wordprocessingShape" mc:Ignorable="w14 w15 w16se w16cid w16 w16cex w16sdtdh w16sdtfl w16du wp14">
+  <w:endnote w:type="separator" w:id="-1">
+    <w:p>
+      <w:r>
+        <w:separator/>
+      </w:r>
+    </w:p>
+  </w:endnote>
+  <w:endnote w:type="continuationSeparator" w:id="0">
+    <w:p>
+      <w:r>
+        <w:continuationSeparator/>
+      </w:r>
+    </w:p>
+  </w:endnote>
+</w:endnotes>
+</file>
+
+<file path=word/footer1.xml><?xml version="1.0" encoding="utf-8"?>
+<w:ftr xmlns:wpc="http://schemas.microsoft.com/office/word/2010/wordprocessingCanvas" xmlns:cx="http://schemas.microsoft.com/office/drawing/2014/chartex" xmlns:cx1="http://schemas.microsoft.com/office/drawing/2015/9/8/chartex" xmlns:cx2="http://schemas.microsoft.com/office/drawing/2015/10/21/chartex" xmlns:cx3="http://schemas.microsoft.com/office/drawing/2016/5/9/chartex" xmlns:cx4="http://schemas.microsoft.com/office/drawing/2016/5/10/chartex" xmlns:cx5="http://schemas.microsoft.com/office/drawing/2016/5/11/chartex" xmlns:cx6="http://schemas.microsoft.com/office/drawing/2016/5/12/chartex" xmlns:cx7="http://schemas.microsoft.com/office/drawing/2016/5/13/chartex" xmlns:cx8="http://schemas.microsoft.com/office/drawing/2016/5/14/chartex" xmlns:mc="http://schemas.openxmlformats.org/markup-compatibility/2006" xmlns:aink="http://schemas.microsoft.com/office/drawing/2016/ink" xmlns:am3d="http://schemas.microsoft.com/office/drawing/2017/model3d" xmlns:o="urn:schemas-microsoft-com:office:office" xmlns:oel="http://schemas.microsoft.com/office/2019/extlst" xmlns:r="http://schemas.openxmlformats.org/officeDocument/2006/relationships" xmlns:m="http://schemas.openxmlformats.org/officeDocument/2006/math" xmlns:v="urn:schemas-microsoft-com:vml" xmlns:wp14="http://schemas.microsoft.com/office/word/2010/wordprocessingDrawing" xmlns:wp="http://schemas.openxmlformats.org/drawingml/2006/wordprocessingDrawing" xmlns:w10="urn:schemas-microsoft-com:office:word" xmlns:w="http://schemas.openxmlformats.org/wordprocessingml/2006/main" xmlns:w14="http://schemas.microsoft.com/office/word/2010/wordml" xmlns:w15="http://schemas.microsoft.com/office/word/2012/wordml" xmlns:w16cex="http://schemas.microsoft.com/office/word/2018/wordml/cex" xmlns:w16cid="http://schemas.microsoft.com/office/word/2016/wordml/cid" xmlns:w16="http://schemas.microsoft.com/office/word/2018/wordml" xmlns:w16du="http://schemas.microsoft.com/office/word/2023/wordml/word16du" xmlns:w16sdtdh="http://schemas.microsoft.com/office/word/2020/wordml/sdtdatahash" xmlns:w16sdtfl="http://schemas.microsoft.com/office/word/2024/wordml/sdtformatlock" xmlns:w16se="http://schemas.microsoft.com/office/word/2015/wordml/symex" xmlns:wpg="http://schemas.microsoft.com/office/word/2010/wordprocessingGroup" xmlns:wpi="http://schemas.microsoft.com/office/word/2010/wordprocessingInk" xmlns:wne="http://schemas.microsoft.com/office/word/2006/wordml" xmlns:wps="http://schemas.microsoft.com/office/word/2010/wordprocessingShape" mc:Ignorable="w14 w15 w16se w16cid w16 w16cex w16sdtdh w16sdtfl w16du wp14">
+  <w:p>
+    <w:pPr>
+      <w:pStyle w:val="Footer"/>
+    </w:pPr>
+    <w:r>
+      <w:rPr>
+        <w:noProof/>
+      </w:rPr>
+      <mc:AlternateContent>
+        <mc:Choice Requires="wps">
+          <w:drawing>
+            <wp:anchor distT="0" distB="0" distL="0" distR="0" simplePos="0" relativeHeight="251659264" behindDoc="0" locked="0" layoutInCell="1" allowOverlap="1" wp14:anchorId="0BBBCED1" wp14:editId="74D34177">
+              <wp:simplePos x="635" y="635"/>
+              <wp:positionH relativeFrom="page">
+                <wp:align>left</wp:align>
+              </wp:positionH>
+              <wp:positionV relativeFrom="page">
+                <wp:align>bottom</wp:align>
+              </wp:positionV>
+              <wp:extent cx="678180" cy="345440"/>
+              <wp:effectExtent l="0" t="0" r="7620" b="0"/>
+              <wp:wrapNone/>
+              <wp:docPr id="485818892" name="Text Box 2" descr="Internal">
+                <a:extLst xmlns:a="http://schemas.openxmlformats.org/drawingml/2006/main">
+                  <a:ext uri="{5AE41FA2-C0FF-4470-9BD4-5FADCA87CBE2}">
+                    <aclsh:classification xmlns:aclsh="http://schemas.microsoft.com/office/drawing/2020/classificationShape" classificationOutcomeType="ftr"/>
+                  </a:ext>
+                </a:extLst>
+              </wp:docPr>
+              <wp:cNvGraphicFramePr/>
+              <a:graphic xmlns:a="http://schemas.openxmlformats.org/drawingml/2006/main">
+                <a:graphicData uri="http://schemas.microsoft.com/office/word/2010/wordprocessingShape">
+                  <wps:wsp>
+                    <wps:cNvSpPr txBox="1"/>
+                    <wps:spPr>
+                      <a:xfrm>
+                        <a:off x="0" y="0"/>
+                        <a:ext cx="678180" cy="345440"/>
+                      </a:xfrm>
+                      <a:prstGeom prst="rect">
+                        <a:avLst/>
+                      </a:prstGeom>
+                      <a:noFill/>
+                      <a:ln>
+                        <a:noFill/>
+                      </a:ln>
+                    </wps:spPr>
+                    <wps:txbx>
+                      <w:txbxContent>
+                        <w:p>
+                          <w:pPr>
+                            <w:rPr>
+                              <w:rFonts w:ascii="Aptos" w:eastAsia="Aptos" w:hAnsi="Aptos" w:cs="Aptos"/>
+                              <w:noProof/>
+                              <w:color w:val="000000"/>
+                              <w:sz w:val="20"/>
+                              <w:szCs w:val="20"/>
+                            </w:rPr>
+                          </w:pPr>
+                          <w:r>
+                            <w:rPr>
+                              <w:rFonts w:ascii="Aptos" w:eastAsia="Aptos" w:hAnsi="Aptos" w:cs="Aptos"/>
+                              <w:noProof/>
+                              <w:color w:val="000000"/>
+                              <w:sz w:val="20"/>
+                              <w:szCs w:val="20"/>
+                            </w:rPr>
+                            <w:t>Internal</w:t>
+                          </w:r>
+                        </w:p>
+                      </w:txbxContent>
+                    </wps:txbx>
+                    <wps:bodyPr rot="0" spcFirstLastPara="0" vertOverflow="overflow" horzOverflow="overflow" vert="horz" wrap="none" lIns="254000" tIns="0" rIns="0" bIns="190500" numCol="1" spcCol="0" rtlCol="0" fromWordArt="0" anchor="b" anchorCtr="0" forceAA="0" compatLnSpc="1">
+                      <a:prstTxWarp prst="textNoShape">
+                        <a:avLst/>
+                      </a:prstTxWarp>
+                      <a:spAutoFit/>
+                    </wps:bodyPr>
+                  </wps:wsp>
+                </a:graphicData>
+              </a:graphic>
+            </wp:anchor>
+          </w:drawing>
+        </mc:Choice>
+        <mc:Fallback>
+          <w:pict>
+            <v:shapetype w14:anchorId="0BBBCED1" id="_x0000_t202" coordsize="21600,21600" o:spt="202" path="m,l,21600r21600,l21600,xe">
+              <v:stroke joinstyle="miter"/>
+              <v:path gradientshapeok="t" o:connecttype="rect"/>
+            </v:shapetype>
+            <v:shape id="Text Box 2" o:spid="_x0000_s1026" type="#_x0000_t202" alt="Internal" style="position:absolute;margin-left:0;margin-top:0;width:53.4pt;height:27.2pt;z-index:251659264;visibility:visible;mso-wrap-style:none;mso-wrap-distance-left:0;mso-wrap-distance-top:0;mso-wrap-distance-right:0;mso-wrap-distance-bottom:0;mso-position-horizontal:left;mso-position-horizontal-relative:page;mso-position-vertical:bottom;mso-position-vertical-relative:page;v-text-anchor:bottom" o:gfxdata="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" filled="f" stroked="f">
+              <v:fill o:detectmouseclick="t"/>
+              <v:textbox style="mso-fit-shape-to-text:t" inset="20pt,0,0,15pt">
+                <w:txbxContent>
+                  <w:p>
+                    <w:pPr>
+                      <w:rPr>
+                        <w:rFonts w:ascii="Aptos" w:eastAsia="Aptos" w:hAnsi="Aptos" w:cs="Aptos"/>
+                        <w:noProof/>
+                        <w:color w:val="000000"/>
+                        <w:sz w:val="20"/>
+                        <w:szCs w:val="20"/>
+                      </w:rPr>
+                    </w:pPr>
+                    <w:r>
+                      <w:rPr>
+                        <w:rFonts w:ascii="Aptos" w:eastAsia="Aptos" w:hAnsi="Aptos" w:cs="Aptos"/>
+                        <w:noProof/>
+                        <w:color w:val="000000"/>
+                        <w:sz w:val="20"/>
+                        <w:szCs w:val="20"/>
+                      </w:rPr>
+                      <w:t>Internal</w:t>
+                    </w:r>
+                  </w:p>
+                </w:txbxContent>
+              </v:textbox>
+              <w10:wrap anchorx="page" anchory="page"/>
+            </v:shape>
+          </w:pict>
+        </mc:Fallback>
+      </mc:AlternateContent>
+    </w:r>
+  </w:p>
+</w:ftr>
+</file>
+
+<file path=word/footer2.xml><?xml version="1.0" encoding="utf-8"?>
+<w:ftr xmlns:wpc="http://schemas.microsoft.com/office/word/2010/wordprocessingCanvas" xmlns:cx="http://schemas.microsoft.com/office/drawing/2014/chartex" xmlns:cx1="http://schemas.microsoft.com/office/drawing/2015/9/8/chartex" xmlns:cx2="http://schemas.microsoft.com/office/drawing/2015/10/21/chartex" xmlns:cx3="http://schemas.microsoft.com/office/drawing/2016/5/9/chartex" xmlns:cx4="http://schemas.microsoft.com/office/drawing/2016/5/10/chartex" xmlns:cx5="http://schemas.microsoft.com/office/drawing/2016/5/11/chartex" xmlns:cx6="http://schemas.microsoft.com/office/drawing/2016/5/12/chartex" xmlns:cx7="http://schemas.microsoft.com/office/drawing/2016/5/13/chartex" xmlns:cx8="http://schemas.microsoft.com/office/drawing/2016/5/14/chartex" xmlns:mc="http://schemas.openxmlformats.org/markup-compatibility/2006" xmlns:aink="http://schemas.microsoft.com/office/drawing/2016/ink" xmlns:am3d="http://schemas.microsoft.com/office/drawing/2017/model3d" xmlns:o="urn:schemas-microsoft-com:office:office" xmlns:oel="http://schemas.microsoft.com/office/2019/extlst" xmlns:r="http://schemas.openxmlformats.org/officeDocument/2006/relationships" xmlns:m="http://schemas.openxmlformats.org/officeDocument/2006/math" xmlns:v="urn:schemas-microsoft-com:vml" xmlns:wp14="http://schemas.microsoft.com/office/word/2010/wordprocessingDrawing" xmlns:wp="http://schemas.openxmlformats.org/drawingml/2006/wordprocessingDrawing" xmlns:w10="urn:schemas-microsoft-com:office:word" xmlns:w="http://schemas.openxmlformats.org/wordprocessingml/2006/main" xmlns:w14="http://schemas.microsoft.com/office/word/2010/wordml" xmlns:w15="http://schemas.microsoft.com/office/word/2012/wordml" xmlns:w16cex="http://schemas.microsoft.com/office/word/2018/wordml/cex" xmlns:w16cid="http://schemas.microsoft.com/office/word/2016/wordml/cid" xmlns:w16="http://schemas.microsoft.com/office/word/2018/wordml" xmlns:w16du="http://schemas.microsoft.com/office/word/2023/wordml/word16du" xmlns:w16sdtdh="http://schemas.microsoft.com/office/word/2020/wordml/sdtdatahash" xmlns:w16sdtfl="http://schemas.microsoft.com/office/word/2024/wordml/sdtformatlock" xmlns:w16se="http://schemas.microsoft.com/office/word/2015/wordml/symex" xmlns:wpg="http://schemas.microsoft.com/office/word/2010/wordprocessingGroup" xmlns:wpi="http://schemas.microsoft.com/office/word/2010/wordprocessingInk" xmlns:wne="http://schemas.microsoft.com/office/word/2006/wordml" xmlns:wps="http://schemas.microsoft.com/office/word/2010/wordprocessingShape" mc:Ignorable="w14 w15 w16se w16cid w16 w16cex w16sdtdh w16sdtfl w16du wp14">
+  <w:p>
+    <w:pPr>
+      <w:pStyle w:val="Footer"/>
+    </w:pPr>
+    <w:r>
+      <w:rPr>
+        <w:noProof/>
+      </w:rPr>
+      <mc:AlternateContent>
+        <mc:Choice Requires="wps">
+          <w:drawing>
+            <wp:anchor distT="0" distB="0" distL="0" distR="0" simplePos="0" relativeHeight="251660288" behindDoc="0" locked="0" layoutInCell="1" allowOverlap="1" wp14:anchorId="00CB2968" wp14:editId="67BB6A18">
+              <wp:simplePos x="635" y="635"/>
+              <wp:positionH relativeFrom="page">
+                <wp:align>left</wp:align>
+              </wp:positionH>
+              <wp:positionV relativeFrom="page">
+                <wp:align>bottom</wp:align>
+              </wp:positionV>
+              <wp:extent cx="678180" cy="345440"/>
+              <wp:effectExtent l="0" t="0" r="7620" b="0"/>
+              <wp:wrapNone/>
+              <wp:docPr id="498400065" name="Text Box 3" descr="Internal">
+                <a:extLst xmlns:a="http://schemas.openxmlformats.org/drawingml/2006/main">
+                  <a:ext uri="{5AE41FA2-C0FF-4470-9BD4-5FADCA87CBE2}">
+                    <aclsh:classification xmlns:aclsh="http://schemas.microsoft.com/office/drawing/2020/classificationShape" classificationOutcomeType="ftr"/>
+                  </a:ext>
+                </a:extLst>
+              </wp:docPr>
+              <wp:cNvGraphicFramePr/>
+              <a:graphic xmlns:a="http://schemas.openxmlformats.org/drawingml/2006/main">
+                <a:graphicData uri="http://schemas.microsoft.com/office/word/2010/wordprocessingShape">
+                  <wps:wsp>
+                    <wps:cNvSpPr txBox="1"/>
+                    <wps:spPr>
+                      <a:xfrm>
+                        <a:off x="0" y="0"/>
+                        <a:ext cx="678180" cy="345440"/>
+                      </a:xfrm>
+                      <a:prstGeom prst="rect">
+                        <a:avLst/>
+                      </a:prstGeom>
+                      <a:noFill/>
+                      <a:ln>
+                        <a:noFill/>
+                      </a:ln>
+                    </wps:spPr>
+                    <wps:txbx>
+                      <w:txbxContent>
+                        <w:p>
+                          <w:pPr>
+                            <w:rPr>
+                              <w:rFonts w:ascii="Aptos" w:eastAsia="Aptos" w:hAnsi="Aptos" w:cs="Aptos"/>
+                              <w:noProof/>
+                              <w:color w:val="000000"/>
+                              <w:sz w:val="20"/>
+                              <w:szCs w:val="20"/>
+                            </w:rPr>
+                          </w:pPr>
+                          <w:r>
+                            <w:rPr>
+                              <w:rFonts w:ascii="Aptos" w:eastAsia="Aptos" w:hAnsi="Aptos" w:cs="Aptos"/>
+                              <w:noProof/>
+                              <w:color w:val="000000"/>
+                              <w:sz w:val="20"/>
+                              <w:szCs w:val="20"/>
+                            </w:rPr>
+                            <w:t>Internal</w:t>
+                          </w:r>
+                        </w:p>
+                      </w:txbxContent>
+                    </wps:txbx>
+                    <wps:bodyPr rot="0" spcFirstLastPara="0" vertOverflow="overflow" horzOverflow="overflow" vert="horz" wrap="none" lIns="254000" tIns="0" rIns="0" bIns="190500" numCol="1" spcCol="0" rtlCol="0" fromWordArt="0" anchor="b" anchorCtr="0" forceAA="0" compatLnSpc="1">
+                      <a:prstTxWarp prst="textNoShape">
+                        <a:avLst/>
+                      </a:prstTxWarp>
+                      <a:spAutoFit/>
+                    </wps:bodyPr>
+                  </wps:wsp>
+                </a:graphicData>
+              </a:graphic>
+            </wp:anchor>
+          </w:drawing>
+        </mc:Choice>
+        <mc:Fallback>
+          <w:pict>
+            <v:shapetype w14:anchorId="00CB2968" id="_x0000_t202" coordsize="21600,21600" o:spt="202" path="m,l,21600r21600,l21600,xe">
+              <v:stroke joinstyle="miter"/>
+              <v:path gradientshapeok="t" o:connecttype="rect"/>
+            </v:shapetype>
+            <v:shape id="Text Box 3" o:spid="_x0000_s1027" type="#_x0000_t202" alt="Internal" style="position:absolute;margin-left:0;margin-top:0;width:53.4pt;height:27.2pt;z-index:251660288;visibility:visible;mso-wrap-style:none;mso-wrap-distance-left:0;mso-wrap-distance-top:0;mso-wrap-distance-right:0;mso-wrap-distance-bottom:0;mso-position-horizontal:left;mso-position-horizontal-relative:page;mso-position-vertical:bottom;mso-position-vertical-relative:page;v-text-anchor:bottom" o:gfxdata="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" filled="f" stroked="f">
+              <v:fill o:detectmouseclick="t"/>
+              <v:textbox style="mso-fit-shape-to-text:t" inset="20pt,0,0,15pt">
+                <w:txbxContent>
+                  <w:p>
+                    <w:pPr>
+                      <w:rPr>
+                        <w:rFonts w:ascii="Aptos" w:eastAsia="Aptos" w:hAnsi="Aptos" w:cs="Aptos"/>
+                        <w:noProof/>
+                        <w:color w:val="000000"/>
+                        <w:sz w:val="20"/>
+                        <w:szCs w:val="20"/>
+                      </w:rPr>
+                    </w:pPr>
+                    <w:r>
+                      <w:rPr>
+                        <w:rFonts w:ascii="Aptos" w:eastAsia="Aptos" w:hAnsi="Aptos" w:cs="Aptos"/>
+                        <w:noProof/>
+                        <w:color w:val="000000"/>
+                        <w:sz w:val="20"/>
+                        <w:szCs w:val="20"/>
+                      </w:rPr>
+                      <w:t>Internal</w:t>
+                    </w:r>
+                  </w:p>
+                </w:txbxContent>
+              </v:textbox>
+              <w10:wrap anchorx="page" anchory="page"/>
+            </v:shape>
+          </w:pict>
+        </mc:Fallback>
+      </mc:AlternateContent>
+    </w:r>
+  </w:p>
+</w:ftr>
+</file>
+
+<file path=word/footer3.xml><?xml version="1.0" encoding="utf-8"?>
+<w:ftr xmlns:wpc="http://schemas.microsoft.com/office/word/2010/wordprocessingCanvas" xmlns:cx="http://schemas.microsoft.com/office/drawing/2014/chartex" xmlns:cx1="http://schemas.microsoft.com/office/drawing/2015/9/8/chartex" xmlns:cx2="http://schemas.microsoft.com/office/drawing/2015/10/21/chartex" xmlns:cx3="http://schemas.microsoft.com/office/drawing/2016/5/9/chartex" xmlns:cx4="http://schemas.microsoft.com/office/drawing/2016/5/10/chartex" xmlns:cx5="http://schemas.microsoft.com/office/drawing/2016/5/11/chartex" xmlns:cx6="http://schemas.microsoft.com/office/drawing/2016/5/12/chartex" xmlns:cx7="http://schemas.microsoft.com/office/drawing/2016/5/13/chartex" xmlns:cx8="http://schemas.microsoft.com/office/drawing/2016/5/14/chartex" xmlns:mc="http://schemas.openxmlformats.org/markup-compatibility/2006" xmlns:aink="http://schemas.microsoft.com/office/drawing/2016/ink" xmlns:am3d="http://schemas.microsoft.com/office/drawing/2017/model3d" xmlns:o="urn:schemas-microsoft-com:office:office" xmlns:oel="http://schemas.microsoft.com/office/2019/extlst" xmlns:r="http://schemas.openxmlformats.org/officeDocument/2006/relationships" xmlns:m="http://schemas.openxmlformats.org/officeDocument/2006/math" xmlns:v="urn:schemas-microsoft-com:vml" xmlns:wp14="http://schemas.microsoft.com/office/word/2010/wordprocessingDrawing" xmlns:wp="http://schemas.openxmlformats.org/drawingml/2006/wordprocessingDrawing" xmlns:w10="urn:schemas-microsoft-com:office:word" xmlns:w="http://schemas.openxmlformats.org/wordprocessingml/2006/main" xmlns:w14="http://schemas.microsoft.com/office/word/2010/wordml" xmlns:w15="http://schemas.microsoft.com/office/word/2012/wordml" xmlns:w16cex="http://schemas.microsoft.com/office/word/2018/wordml/cex" xmlns:w16cid="http://schemas.microsoft.com/office/word/2016/wordml/cid" xmlns:w16="http://schemas.microsoft.com/office/word/2018/wordml" xmlns:w16du="http://schemas.microsoft.com/office/word/2023/wordml/word16du" xmlns:w16sdtdh="http://schemas.microsoft.com/office/word/2020/wordml/sdtdatahash" xmlns:w16sdtfl="http://schemas.microsoft.com/office/word/2024/wordml/sdtformatlock" xmlns:w16se="http://schemas.microsoft.com/office/word/2015/wordml/symex" xmlns:wpg="http://schemas.microsoft.com/office/word/2010/wordprocessingGroup" xmlns:wpi="http://schemas.microsoft.com/office/word/2010/wordprocessingInk" xmlns:wne="http://schemas.microsoft.com/office/word/2006/wordml" xmlns:wps="http://schemas.microsoft.com/office/word/2010/wordprocessingShape" mc:Ignorable="w14 w15 w16se w16cid w16 w16cex w16sdtdh w16sdtfl w16du wp14">
+  <w:p>
+    <w:pPr>
+      <w:pStyle w:val="Footer"/>
+    </w:pPr>
+    <w:r>
+      <w:rPr>
+        <w:noProof/>
+      </w:rPr>
+      <mc:AlternateContent>
+        <mc:Choice Requires="wps">
+          <w:drawing>
+            <wp:anchor distT="0" distB="0" distL="0" distR="0" simplePos="0" relativeHeight="251658240" behindDoc="0" locked="0" layoutInCell="1" allowOverlap="1" wp14:anchorId="000CFFEA" wp14:editId="31D51A8D">
+              <wp:simplePos x="635" y="635"/>
+              <wp:positionH relativeFrom="page">
+                <wp:align>left</wp:align>
+              </wp:positionH>
+              <wp:positionV relativeFrom="page">
+                <wp:align>bottom</wp:align>
+              </wp:positionV>
+              <wp:extent cx="678180" cy="345440"/>
+              <wp:effectExtent l="0" t="0" r="7620" b="0"/>
+              <wp:wrapNone/>
+              <wp:docPr id="2061990017" name="Text Box 1" descr="Internal">
+                <a:extLst xmlns:a="http://schemas.openxmlformats.org/drawingml/2006/main">
+                  <a:ext uri="{5AE41FA2-C0FF-4470-9BD4-5FADCA87CBE2}">
+                    <aclsh:classification xmlns:aclsh="http://schemas.microsoft.com/office/drawing/2020/classificationShape" classificationOutcomeType="ftr"/>
+                  </a:ext>
+                </a:extLst>
+              </wp:docPr>
+              <wp:cNvGraphicFramePr/>
+              <a:graphic xmlns:a="http://schemas.openxmlformats.org/drawingml/2006/main">
+                <a:graphicData uri="http://schemas.microsoft.com/office/word/2010/wordprocessingShape">
+                  <wps:wsp>
+                    <wps:cNvSpPr txBox="1"/>
+                    <wps:spPr>
+                      <a:xfrm>
+                        <a:off x="0" y="0"/>
+                        <a:ext cx="678180" cy="345440"/>
+                      </a:xfrm>
+                      <a:prstGeom prst="rect">
+                        <a:avLst/>
+                      </a:prstGeom>
+                      <a:noFill/>
+                      <a:ln>
+                        <a:noFill/>
+                      </a:ln>
+                    </wps:spPr>
+                    <wps:txbx>
+                      <w:txbxContent>
+                        <w:p>
+                          <w:pPr>
+                            <w:rPr>
+                              <w:rFonts w:ascii="Aptos" w:eastAsia="Aptos" w:hAnsi="Aptos" w:cs="Aptos"/>
+                              <w:noProof/>
+                              <w:color w:val="000000"/>
+                              <w:sz w:val="20"/>
+                              <w:szCs w:val="20"/>
+                            </w:rPr>
+                          </w:pPr>
+                          <w:r>
+                            <w:rPr>
+                              <w:rFonts w:ascii="Aptos" w:eastAsia="Aptos" w:hAnsi="Aptos" w:cs="Aptos"/>
+                              <w:noProof/>
+                              <w:color w:val="000000"/>
+                              <w:sz w:val="20"/>
+                              <w:szCs w:val="20"/>
+                            </w:rPr>
+                            <w:t>Internal</w:t>
+                          </w:r>
+                        </w:p>
+                      </w:txbxContent>
+                    </wps:txbx>
+                    <wps:bodyPr rot="0" spcFirstLastPara="0" vertOverflow="overflow" horzOverflow="overflow" vert="horz" wrap="none" lIns="254000" tIns="0" rIns="0" bIns="190500" numCol="1" spcCol="0" rtlCol="0" fromWordArt="0" anchor="b" anchorCtr="0" forceAA="0" compatLnSpc="1">
+                      <a:prstTxWarp prst="textNoShape">
+                        <a:avLst/>
+                      </a:prstTxWarp>
+                      <a:spAutoFit/>
+                    </wps:bodyPr>
+                  </wps:wsp>
+                </a:graphicData>
+              </a:graphic>
+            </wp:anchor>
+          </w:drawing>
+        </mc:Choice>
+        <mc:Fallback>
+          <w:pict>
+            <v:shapetype w14:anchorId="000CFFEA" id="_x0000_t202" coordsize="21600,21600" o:spt="202" path="m,l,21600r21600,l21600,xe">
+              <v:stroke joinstyle="miter"/>
+              <v:path gradientshapeok="t" o:connecttype="rect"/>
+            </v:shapetype>
+            <v:shape id="Text Box 1" o:spid="_x0000_s1028" type="#_x0000_t202" alt="Internal" style="position:absolute;margin-left:0;margin-top:0;width:53.4pt;height:27.2pt;z-index:251658240;visibility:visible;mso-wrap-style:none;mso-wrap-distance-left:0;mso-wrap-distance-top:0;mso-wrap-distance-right:0;mso-wrap-distance-bottom:0;mso-position-horizontal:left;mso-position-horizontal-relative:page;mso-position-vertical:bottom;mso-position-vertical-relative:page;v-text-anchor:bottom" o:gfxdata="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" filled="f" stroked="f">
+              <v:fill o:detectmouseclick="t"/>
+              <v:textbox style="mso-fit-shape-to-text:t" inset="20pt,0,0,15pt">
+                <w:txbxContent>
+                  <w:p>
+                    <w:pPr>
+                      <w:rPr>
+                        <w:rFonts w:ascii="Aptos" w:eastAsia="Aptos" w:hAnsi="Aptos" w:cs="Aptos"/>
+                        <w:noProof/>
+                        <w:color w:val="000000"/>
+                        <w:sz w:val="20"/>
+                        <w:szCs w:val="20"/>
+                      </w:rPr>
+                    </w:pPr>
+                    <w:r>
+                      <w:rPr>
+                        <w:rFonts w:ascii="Aptos" w:eastAsia="Aptos" w:hAnsi="Aptos" w:cs="Aptos"/>
+                        <w:noProof/>
+                        <w:color w:val="000000"/>
+                        <w:sz w:val="20"/>
+                        <w:szCs w:val="20"/>
+                      </w:rPr>
+                      <w:t>Internal</w:t>
+                    </w:r>
+                  </w:p>
+                </w:txbxContent>
+              </v:textbox>
+              <w10:wrap anchorx="page" anchory="page"/>
+            </v:shape>
+          </w:pict>
+        </mc:Fallback>
+      </mc:AlternateContent>
+    </w:r>
+  </w:p>
+</w:ftr>
 </file>
 
 <file path=word/footnotes.xml><?xml version="1.0" encoding="utf-8"?>
-<w:footnotes xmlns:wpc="http://schemas.microsoft.com/office/word/2010/wordprocessingCanvas" xmlns:mc="http://schemas.openxmlformats.org/markup-compatibility/2006" xmlns:o="urn:schemas-microsoft-com:office:office" xmlns:r="http://schemas.openxmlformats.org/officeDocument/2006/relationships" xmlns:m="http://schemas.openxmlformats.org/officeDocument/2006/math" xmlns:v="urn:schemas-microsoft-com:vml" xmlns:wp14="http://schemas.microsoft.com/office/word/2010/wordprocessingDrawing" xmlns:wp="http://schemas.openxmlformats.org/drawingml/2006/wordprocessingDrawing" xmlns:w10="urn:schemas-microsoft-com:office:word" xmlns:w="http://schemas.openxmlformats.org/wordprocessingml/2006/main" xmlns:w14="http://schemas.microsoft.com/office/word/2010/wordml" xmlns:w15="http://schemas.microsoft.com/office/word/2012/wordml" xmlns:wpg="http://schemas.microsoft.com/office/word/2010/wordprocessingGroup" xmlns:wpi="http://schemas.microsoft.com/office/word/2010/wordprocessingInk" xmlns:wne="http://schemas.microsoft.com/office/word/2006/wordml" xmlns:wps="http://schemas.microsoft.com/office/word/2010/wordprocessingShape" mc:Ignorable="w14 w15 wp14">
+<w:footnotes xmlns:wpc="http://schemas.microsoft.com/office/word/2010/wordprocessingCanvas" xmlns:cx="http://schemas.microsoft.com/office/drawing/2014/chartex" xmlns:cx1="http://schemas.microsoft.com/office/drawing/2015/9/8/chartex" xmlns:cx2="http://schemas.microsoft.com/office/drawing/2015/10/21/chartex" xmlns:cx3="http://schemas.microsoft.com/office/drawing/2016/5/9/chartex" xmlns:cx4="http://schemas.microsoft.com/office/drawing/2016/5/10/chartex" xmlns:cx5="http://schemas.microsoft.com/office/drawing/2016/5/11/chartex" xmlns:cx6="http://schemas.microsoft.com/office/drawing/2016/5/12/chartex" xmlns:cx7="http://schemas.microsoft.com/office/drawing/2016/5/13/chartex" xmlns:cx8="http://schemas.microsoft.com/office/drawing/2016/5/14/chartex" xmlns:mc="http://schemas.openxmlformats.org/markup-compatibility/2006" xmlns:aink="http://schemas.microsoft.com/office/drawing/2016/ink" xmlns:am3d="http://schemas.microsoft.com/office/drawing/2017/model3d" xmlns:o="urn:schemas-microsoft-com:office:office" xmlns:oel="http://schemas.microsoft.com/office/2019/extlst" xmlns:r="http://schemas.openxmlformats.org/officeDocument/2006/relationships" xmlns:m="http://schemas.openxmlformats.org/officeDocument/2006/math" xmlns:v="urn:schemas-microsoft-com:vml" xmlns:wp14="http://schemas.microsoft.com/office/word/2010/wordprocessingDrawing" xmlns:wp="http://schemas.openxmlformats.org/drawingml/2006/wordprocessingDrawing" xmlns:w10="urn:schemas-microsoft-com:office:word" xmlns:w="http://schemas.openxmlformats.org/wordprocessingml/2006/main" xmlns:w14="http://schemas.microsoft.com/office/word/2010/wordml" xmlns:w15="http://schemas.microsoft.com/office/word/2012/wordml" xmlns:w16cex="http://schemas.microsoft.com/office/word/2018/wordml/cex" xmlns:w16cid="http://schemas.microsoft.com/office/word/2016/wordml/cid" xmlns:w16="http://schemas.microsoft.com/office/word/2018/wordml" xmlns:w16du="http://schemas.microsoft.com/office/word/2023/wordml/word16du" xmlns:w16sdtdh="http://schemas.microsoft.com/office/word/2020/wordml/sdtdatahash" xmlns:w16sdtfl="http://schemas.microsoft.com/office/word/2024/wordml/sdtformatlock" xmlns:w16se="http://schemas.microsoft.com/office/word/2015/wordml/symex" xmlns:wpg="http://schemas.microsoft.com/office/word/2010/wordprocessingGroup" xmlns:wpi="http://schemas.microsoft.com/office/word/2010/wordprocessingInk" xmlns:wne="http://schemas.microsoft.com/office/word/2006/wordml" xmlns:wps="http://schemas.microsoft.com/office/word/2010/wordprocessingShape" mc:Ignorable="w14 w15 w16se w16cid w16 w16cex w16sdtdh w16sdtfl w16du wp14">
   <w:footnote w:type="separator" w:id="-1">
     <w:p>
-      <w:pPr>
-        <w:spacing w:after="0" w:line="240" w:lineRule="auto"/>
-      </w:pPr>
-      <w:r>
-        <w:rPr>
-          <w:rStyle w:val="FootnoteReference"/>
-        </w:rPr>
-        <w:footnoteRef/>
-      </w:r>
       <w:r>
         <w:separator/>
       </w:r>
@@ -1312,15 +1720,6 @@
   </w:footnote>
   <w:footnote w:type="continuationSeparator" w:id="0">
     <w:p>
-      <w:pPr>
-        <w:spacing w:after="0" w:line="240" w:lineRule="auto"/>
-      </w:pPr>
-      <w:r>
-        <w:rPr>
-          <w:rStyle w:val="FootnoteReference"/>
-        </w:rPr>
-        <w:footnoteRef/>
-      </w:r>
       <w:r>
         <w:continuationSeparator/>
       </w:r>
@@ -1330,10 +1729,66 @@
 </file>
 
 <file path=word/numbering.xml><?xml version="1.0" encoding="utf-8"?>
-<w:numbering xmlns:wpc="http://schemas.microsoft.com/office/word/2010/wordprocessingCanvas" xmlns:mc="http://schemas.openxmlformats.org/markup-compatibility/2006" xmlns:o="urn:schemas-microsoft-com:office:office" xmlns:r="http://schemas.openxmlformats.org/officeDocument/2006/relationships" xmlns:m="http://schemas.openxmlformats.org/officeDocument/2006/math" xmlns:v="urn:schemas-microsoft-com:vml" xmlns:wp14="http://schemas.microsoft.com/office/word/2010/wordprocessingDrawing" xmlns:wp="http://schemas.openxmlformats.org/drawingml/2006/wordprocessingDrawing" xmlns:w10="urn:schemas-microsoft-com:office:word" xmlns:w="http://schemas.openxmlformats.org/wordprocessingml/2006/main" xmlns:w14="http://schemas.microsoft.com/office/word/2010/wordml" xmlns:w15="http://schemas.microsoft.com/office/word/2012/wordml" xmlns:wpg="http://schemas.microsoft.com/office/word/2010/wordprocessingGroup" xmlns:wpi="http://schemas.microsoft.com/office/word/2010/wordprocessingInk" xmlns:wne="http://schemas.microsoft.com/office/word/2006/wordml" xmlns:wps="http://schemas.microsoft.com/office/word/2010/wordprocessingShape" mc:Ignorable="w14 w15 wp14">
+<w:numbering xmlns:wpc="http://schemas.microsoft.com/office/word/2010/wordprocessingCanvas" xmlns:cx="http://schemas.microsoft.com/office/drawing/2014/chartex" xmlns:cx1="http://schemas.microsoft.com/office/drawing/2015/9/8/chartex" xmlns:cx2="http://schemas.microsoft.com/office/drawing/2015/10/21/chartex" xmlns:cx3="http://schemas.microsoft.com/office/drawing/2016/5/9/chartex" xmlns:cx4="http://schemas.microsoft.com/office/drawing/2016/5/10/chartex" xmlns:cx5="http://schemas.microsoft.com/office/drawing/2016/5/11/chartex" xmlns:cx6="http://schemas.microsoft.com/office/drawing/2016/5/12/chartex" xmlns:cx7="http://schemas.microsoft.com/office/drawing/2016/5/13/chartex" xmlns:cx8="http://schemas.microsoft.com/office/drawing/2016/5/14/chartex" xmlns:mc="http://schemas.openxmlformats.org/markup-compatibility/2006" xmlns:aink="http://schemas.microsoft.com/office/drawing/2016/ink" xmlns:am3d="http://schemas.microsoft.com/office/drawing/2017/model3d" xmlns:o="urn:schemas-microsoft-com:office:office" xmlns:oel="http://schemas.microsoft.com/office/2019/extlst" xmlns:r="http://schemas.openxmlformats.org/officeDocument/2006/relationships" xmlns:m="http://schemas.openxmlformats.org/officeDocument/2006/math" xmlns:v="urn:schemas-microsoft-com:vml" xmlns:wp14="http://schemas.microsoft.com/office/word/2010/wordprocessingDrawing" xmlns:wp="http://schemas.openxmlformats.org/drawingml/2006/wordprocessingDrawing" xmlns:w10="urn:schemas-microsoft-com:office:word" xmlns:w="http://schemas.openxmlformats.org/wordprocessingml/2006/main" xmlns:w14="http://schemas.microsoft.com/office/word/2010/wordml" xmlns:w15="http://schemas.microsoft.com/office/word/2012/wordml" xmlns:w16cex="http://schemas.microsoft.com/office/word/2018/wordml/cex" xmlns:w16cid="http://schemas.microsoft.com/office/word/2016/wordml/cid" xmlns:w16="http://schemas.microsoft.com/office/word/2018/wordml" xmlns:w16du="http://schemas.microsoft.com/office/word/2023/wordml/word16du" xmlns:w16sdtdh="http://schemas.microsoft.com/office/word/2020/wordml/sdtdatahash" xmlns:w16sdtfl="http://schemas.microsoft.com/office/word/2024/wordml/sdtformatlock" xmlns:w16se="http://schemas.microsoft.com/office/word/2015/wordml/symex" xmlns:wpg="http://schemas.microsoft.com/office/word/2010/wordprocessingGroup" xmlns:wpi="http://schemas.microsoft.com/office/word/2010/wordprocessingInk" xmlns:wne="http://schemas.microsoft.com/office/word/2006/wordml" xmlns:wps="http://schemas.microsoft.com/office/word/2010/wordprocessingShape" mc:Ignorable="w14 w15 w16se w16cid w16 w16cex w16sdtdh w16sdtfl w16du wp14">
+  <w:abstractNum w:abstractNumId="0" w15:restartNumberingAfterBreak="0">
+    <w:nsid w:val="34C1015B"/>
+    <w:multiLevelType w:val="hybridMultilevel"/>
+    <w:tmpl w:val="579C605C"/>
+    <w:lvl w:ilvl="0" w:tplc="2566316C">
+      <w:start w:val="1"/>
+      <w:numFmt w:val="bullet"/>
+      <w:lvlText w:val="•"/>
+      <w:lvlJc w:val="left"/>
+      <w:pPr>
+        <w:ind w:left="720" w:hanging="360"/>
+      </w:pPr>
+    </w:lvl>
+    <w:lvl w:ilvl="1" w:tplc="8AF0B642">
+      <w:numFmt w:val="decimal"/>
+      <w:lvlText w:val=""/>
+      <w:lvlJc w:val="left"/>
+    </w:lvl>
+    <w:lvl w:ilvl="2" w:tplc="9F5657C8">
+      <w:numFmt w:val="decimal"/>
+      <w:lvlText w:val=""/>
+      <w:lvlJc w:val="left"/>
+    </w:lvl>
+    <w:lvl w:ilvl="3" w:tplc="01D6AE74">
+      <w:numFmt w:val="decimal"/>
+      <w:lvlText w:val=""/>
+      <w:lvlJc w:val="left"/>
+    </w:lvl>
+    <w:lvl w:ilvl="4" w:tplc="3410ADCA">
+      <w:numFmt w:val="decimal"/>
+      <w:lvlText w:val=""/>
+      <w:lvlJc w:val="left"/>
+    </w:lvl>
+    <w:lvl w:ilvl="5" w:tplc="CF80182E">
+      <w:numFmt w:val="decimal"/>
+      <w:lvlText w:val=""/>
+      <w:lvlJc w:val="left"/>
+    </w:lvl>
+    <w:lvl w:ilvl="6" w:tplc="E2020D38">
+      <w:numFmt w:val="decimal"/>
+      <w:lvlText w:val=""/>
+      <w:lvlJc w:val="left"/>
+    </w:lvl>
+    <w:lvl w:ilvl="7" w:tplc="8ECA8358">
+      <w:numFmt w:val="decimal"/>
+      <w:lvlText w:val=""/>
+      <w:lvlJc w:val="left"/>
+    </w:lvl>
+    <w:lvl w:ilvl="8" w:tplc="416E78D0">
+      <w:numFmt w:val="decimal"/>
+      <w:lvlText w:val=""/>
+      <w:lvlJc w:val="left"/>
+    </w:lvl>
+  </w:abstractNum>
   <w:abstractNum w:abstractNumId="1" w15:restartNumberingAfterBreak="0">
+    <w:nsid w:val="49BB5DE1"/>
     <w:multiLevelType w:val="hybridMultilevel"/>
-    <w:lvl w:ilvl="0" w15:tentative="1">
+    <w:tmpl w:val="9190BE10"/>
+    <w:lvl w:ilvl="0" w:tplc="01929D34">
       <w:start w:val="1"/>
       <w:numFmt w:val="bullet"/>
       <w:lvlText w:val="●"/>
@@ -1342,7 +1797,7 @@
         <w:ind w:left="720" w:hanging="360"/>
       </w:pPr>
     </w:lvl>
-    <w:lvl w:ilvl="1" w15:tentative="1">
+    <w:lvl w:ilvl="1" w:tplc="7B54DA1E">
       <w:start w:val="1"/>
       <w:numFmt w:val="bullet"/>
       <w:lvlText w:val="○"/>
@@ -1351,7 +1806,7 @@
         <w:ind w:left="1440" w:hanging="360"/>
       </w:pPr>
     </w:lvl>
-    <w:lvl w:ilvl="2" w15:tentative="1">
+    <w:lvl w:ilvl="2" w:tplc="3EAA65EA">
       <w:start w:val="1"/>
       <w:numFmt w:val="bullet"/>
       <w:lvlText w:val="■"/>
@@ -1360,7 +1815,7 @@
         <w:ind w:left="2160" w:hanging="360"/>
       </w:pPr>
     </w:lvl>
-    <w:lvl w:ilvl="3" w15:tentative="1">
+    <w:lvl w:ilvl="3" w:tplc="3C48046C">
       <w:start w:val="1"/>
       <w:numFmt w:val="bullet"/>
       <w:lvlText w:val="●"/>
@@ -1369,7 +1824,7 @@
         <w:ind w:left="2880" w:hanging="360"/>
       </w:pPr>
     </w:lvl>
-    <w:lvl w:ilvl="4" w15:tentative="1">
+    <w:lvl w:ilvl="4" w:tplc="E7DA2124">
       <w:start w:val="1"/>
       <w:numFmt w:val="bullet"/>
       <w:lvlText w:val="○"/>
@@ -1378,7 +1833,7 @@
         <w:ind w:left="3600" w:hanging="360"/>
       </w:pPr>
     </w:lvl>
-    <w:lvl w:ilvl="5" w15:tentative="1">
+    <w:lvl w:ilvl="5" w:tplc="B928D528">
       <w:start w:val="1"/>
       <w:numFmt w:val="bullet"/>
       <w:lvlText w:val="■"/>
@@ -1387,7 +1842,7 @@
         <w:ind w:left="4320" w:hanging="360"/>
       </w:pPr>
     </w:lvl>
-    <w:lvl w:ilvl="6" w15:tentative="1">
+    <w:lvl w:ilvl="6" w:tplc="1D406E66">
       <w:start w:val="1"/>
       <w:numFmt w:val="bullet"/>
       <w:lvlText w:val="●"/>
@@ -1396,7 +1851,7 @@
         <w:ind w:left="5040" w:hanging="360"/>
       </w:pPr>
     </w:lvl>
-    <w:lvl w:ilvl="7" w15:tentative="1">
+    <w:lvl w:ilvl="7" w:tplc="D68416E4">
       <w:start w:val="1"/>
       <w:numFmt w:val="bullet"/>
       <w:lvlText w:val="●"/>
@@ -1405,7 +1860,7 @@
         <w:ind w:left="5760" w:hanging="360"/>
       </w:pPr>
     </w:lvl>
-    <w:lvl w:ilvl="8" w15:tentative="1">
+    <w:lvl w:ilvl="8" w:tplc="95D6D0D8">
       <w:start w:val="1"/>
       <w:numFmt w:val="bullet"/>
       <w:lvlText w:val="●"/>
@@ -1416,20 +1871,10 @@
     </w:lvl>
   </w:abstractNum>
   <w:abstractNum w:abstractNumId="2" w15:restartNumberingAfterBreak="0">
+    <w:nsid w:val="597C21BE"/>
     <w:multiLevelType w:val="hybridMultilevel"/>
-    <w:lvl w:ilvl="0" w15:tentative="1">
-      <w:start w:val="1"/>
-      <w:numFmt w:val="bullet"/>
-      <w:lvlText w:val="•"/>
-      <w:lvlJc w:val="left"/>
-      <w:pPr>
-        <w:ind w:left="720" w:hanging="360"/>
-      </w:pPr>
-    </w:lvl>
-  </w:abstractNum>
-  <w:abstractNum w:abstractNumId="3" w15:restartNumberingAfterBreak="0">
-    <w:multiLevelType w:val="hybridMultilevel"/>
-    <w:lvl w:ilvl="0" w15:tentative="1">
+    <w:tmpl w:val="7F80E0E8"/>
+    <w:lvl w:ilvl="0" w:tplc="B55AB428">
       <w:start w:val="1"/>
       <w:numFmt w:val="decimal"/>
       <w:lvlText w:val="%1."/>
@@ -1438,21 +1883,61 @@
         <w:ind w:left="720" w:hanging="360"/>
       </w:pPr>
     </w:lvl>
+    <w:lvl w:ilvl="1" w:tplc="DFA8B40C">
+      <w:numFmt w:val="decimal"/>
+      <w:lvlText w:val=""/>
+      <w:lvlJc w:val="left"/>
+    </w:lvl>
+    <w:lvl w:ilvl="2" w:tplc="C3682312">
+      <w:numFmt w:val="decimal"/>
+      <w:lvlText w:val=""/>
+      <w:lvlJc w:val="left"/>
+    </w:lvl>
+    <w:lvl w:ilvl="3" w:tplc="CAD2677C">
+      <w:numFmt w:val="decimal"/>
+      <w:lvlText w:val=""/>
+      <w:lvlJc w:val="left"/>
+    </w:lvl>
+    <w:lvl w:ilvl="4" w:tplc="75A00A88">
+      <w:numFmt w:val="decimal"/>
+      <w:lvlText w:val=""/>
+      <w:lvlJc w:val="left"/>
+    </w:lvl>
+    <w:lvl w:ilvl="5" w:tplc="57920EE6">
+      <w:numFmt w:val="decimal"/>
+      <w:lvlText w:val=""/>
+      <w:lvlJc w:val="left"/>
+    </w:lvl>
+    <w:lvl w:ilvl="6" w:tplc="CEDEC34C">
+      <w:numFmt w:val="decimal"/>
+      <w:lvlText w:val=""/>
+      <w:lvlJc w:val="left"/>
+    </w:lvl>
+    <w:lvl w:ilvl="7" w:tplc="CF465EC2">
+      <w:numFmt w:val="decimal"/>
+      <w:lvlText w:val=""/>
+      <w:lvlJc w:val="left"/>
+    </w:lvl>
+    <w:lvl w:ilvl="8" w:tplc="CB786814">
+      <w:numFmt w:val="decimal"/>
+      <w:lvlText w:val=""/>
+      <w:lvlJc w:val="left"/>
+    </w:lvl>
   </w:abstractNum>
-  <w:num w:numId="1">
+  <w:num w:numId="1" w16cid:durableId="866991389">
     <w:abstractNumId w:val="1"/>
     <w:lvlOverride w:ilvl="0">
       <w:startOverride w:val="1"/>
     </w:lvlOverride>
   </w:num>
-  <w:num w:numId="2">
-    <w:abstractNumId w:val="2"/>
+  <w:num w:numId="2" w16cid:durableId="1207067237">
+    <w:abstractNumId w:val="0"/>
     <w:lvlOverride w:ilvl="0">
       <w:startOverride w:val="1"/>
     </w:lvlOverride>
   </w:num>
-  <w:num w:numId="3">
-    <w:abstractNumId w:val="3"/>
+  <w:num w:numId="3" w16cid:durableId="1302150738">
+    <w:abstractNumId w:val="2"/>
     <w:lvlOverride w:ilvl="0">
       <w:startOverride w:val="1"/>
     </w:lvlOverride>
@@ -1461,65 +1946,457 @@
 </file>
 
 <file path=word/styles.xml><?xml version="1.0" encoding="utf-8"?>
-<w:styles xmlns:mc="http://schemas.openxmlformats.org/markup-compatibility/2006" xmlns:r="http://schemas.openxmlformats.org/officeDocument/2006/relationships" xmlns:w="http://schemas.openxmlformats.org/wordprocessingml/2006/main" xmlns:w14="http://schemas.microsoft.com/office/word/2010/wordml" xmlns:w15="http://schemas.microsoft.com/office/word/2012/wordml" mc:Ignorable="w14 w15">
+<w:styles xmlns:mc="http://schemas.openxmlformats.org/markup-compatibility/2006" xmlns:r="http://schemas.openxmlformats.org/officeDocument/2006/relationships" xmlns:w="http://schemas.openxmlformats.org/wordprocessingml/2006/main" xmlns:w14="http://schemas.microsoft.com/office/word/2010/wordml" xmlns:w15="http://schemas.microsoft.com/office/word/2012/wordml" xmlns:w16cex="http://schemas.microsoft.com/office/word/2018/wordml/cex" xmlns:w16cid="http://schemas.microsoft.com/office/word/2016/wordml/cid" xmlns:w16="http://schemas.microsoft.com/office/word/2018/wordml" xmlns:w16du="http://schemas.microsoft.com/office/word/2023/wordml/word16du" xmlns:w16sdtdh="http://schemas.microsoft.com/office/word/2020/wordml/sdtdatahash" xmlns:w16sdtfl="http://schemas.microsoft.com/office/word/2024/wordml/sdtformatlock" xmlns:w16se="http://schemas.microsoft.com/office/word/2015/wordml/symex" mc:Ignorable="w14 w15 w16se w16cid w16 w16cex w16sdtdh w16sdtfl w16du">
   <w:docDefaults>
     <w:rPrDefault>
       <w:rPr>
-        <w:rFonts w:ascii="Arial" w:cs="Arial" w:eastAsia="Arial" w:hAnsi="Arial"/>
+        <w:rFonts w:ascii="Arial" w:eastAsia="Arial" w:hAnsi="Arial" w:cs="Arial"/>
         <w:sz w:val="24"/>
         <w:szCs w:val="24"/>
+        <w:lang w:val="en-US" w:eastAsia="en-US" w:bidi="ar-SA"/>
       </w:rPr>
     </w:rPrDefault>
     <w:pPrDefault/>
   </w:docDefaults>
-  <w:style w:type="paragraph" w:styleId="Title">
-    <w:name w:val="Title"/>
-    <w:basedOn w:val="Normal"/>
-    <w:next w:val="Normal"/>
+  <w:latentStyles w:defLockedState="0" w:defUIPriority="99" w:defSemiHidden="0" w:defUnhideWhenUsed="0" w:defQFormat="0" w:count="376">
+    <w:lsdException w:name="Normal" w:uiPriority="0" w:qFormat="1"/>
+    <w:lsdException w:name="heading 1" w:uiPriority="9" w:qFormat="1"/>
+    <w:lsdException w:name="heading 2" w:semiHidden="1" w:uiPriority="9" w:unhideWhenUsed="1" w:qFormat="1"/>
+    <w:lsdException w:name="heading 3" w:semiHidden="1" w:uiPriority="9" w:unhideWhenUsed="1" w:qFormat="1"/>
+    <w:lsdException w:name="heading 4" w:semiHidden="1" w:uiPriority="9" w:unhideWhenUsed="1" w:qFormat="1"/>
+    <w:lsdException w:name="heading 5" w:semiHidden="1" w:uiPriority="9" w:unhideWhenUsed="1" w:qFormat="1"/>
+    <w:lsdException w:name="heading 6" w:semiHidden="1" w:uiPriority="9" w:unhideWhenUsed="1" w:qFormat="1"/>
+    <w:lsdException w:name="heading 7" w:semiHidden="1" w:uiPriority="9" w:unhideWhenUsed="1" w:qFormat="1"/>
+    <w:lsdException w:name="heading 8" w:semiHidden="1" w:uiPriority="9" w:unhideWhenUsed="1" w:qFormat="1"/>
+    <w:lsdException w:name="heading 9" w:semiHidden="1" w:uiPriority="9" w:unhideWhenUsed="1" w:qFormat="1"/>
+    <w:lsdException w:name="index 1" w:semiHidden="1" w:unhideWhenUsed="1"/>
+    <w:lsdException w:name="index 2" w:semiHidden="1" w:unhideWhenUsed="1"/>
+    <w:lsdException w:name="index 3" w:semiHidden="1" w:unhideWhenUsed="1"/>
+    <w:lsdException w:name="index 4" w:semiHidden="1" w:unhideWhenUsed="1"/>
+    <w:lsdException w:name="index 5" w:semiHidden="1" w:unhideWhenUsed="1"/>
+    <w:lsdException w:name="index 6" w:semiHidden="1" w:unhideWhenUsed="1"/>
+    <w:lsdException w:name="index 7" w:semiHidden="1" w:unhideWhenUsed="1"/>
+    <w:lsdException w:name="index 8" w:semiHidden="1" w:unhideWhenUsed="1"/>
+    <w:lsdException w:name="index 9" w:semiHidden="1" w:unhideWhenUsed="1"/>
+    <w:lsdException w:name="toc 1" w:semiHidden="1" w:uiPriority="39" w:unhideWhenUsed="1"/>
+    <w:lsdException w:name="toc 2" w:semiHidden="1" w:uiPriority="39" w:unhideWhenUsed="1"/>
+    <w:lsdException w:name="toc 3" w:semiHidden="1" w:uiPriority="39" w:unhideWhenUsed="1"/>
+    <w:lsdException w:name="toc 4" w:semiHidden="1" w:uiPriority="39" w:unhideWhenUsed="1"/>
+    <w:lsdException w:name="toc 5" w:semiHidden="1" w:uiPriority="39" w:unhideWhenUsed="1"/>
+    <w:lsdException w:name="toc 6" w:semiHidden="1" w:uiPriority="39" w:unhideWhenUsed="1"/>
+    <w:lsdException w:name="toc 7" w:semiHidden="1" w:uiPriority="39" w:unhideWhenUsed="1"/>
+    <w:lsdException w:name="toc 8" w:semiHidden="1" w:uiPriority="39" w:unhideWhenUsed="1"/>
+    <w:lsdException w:name="toc 9" w:semiHidden="1" w:uiPriority="39" w:unhideWhenUsed="1"/>
+    <w:lsdException w:name="Normal Indent" w:semiHidden="1" w:unhideWhenUsed="1"/>
+    <w:lsdException w:name="footnote text" w:semiHidden="1" w:unhideWhenUsed="1"/>
+    <w:lsdException w:name="annotation text" w:semiHidden="1" w:unhideWhenUsed="1"/>
+    <w:lsdException w:name="header" w:semiHidden="1" w:unhideWhenUsed="1"/>
+    <w:lsdException w:name="footer" w:semiHidden="1" w:unhideWhenUsed="1"/>
+    <w:lsdException w:name="index heading" w:semiHidden="1" w:unhideWhenUsed="1"/>
+    <w:lsdException w:name="caption" w:semiHidden="1" w:uiPriority="35" w:unhideWhenUsed="1" w:qFormat="1"/>
+    <w:lsdException w:name="table of figures" w:semiHidden="1" w:unhideWhenUsed="1"/>
+    <w:lsdException w:name="envelope address" w:semiHidden="1" w:unhideWhenUsed="1"/>
+    <w:lsdException w:name="envelope return" w:semiHidden="1" w:unhideWhenUsed="1"/>
+    <w:lsdException w:name="footnote reference" w:semiHidden="1" w:unhideWhenUsed="1"/>
+    <w:lsdException w:name="annotation reference" w:semiHidden="1" w:unhideWhenUsed="1"/>
+    <w:lsdException w:name="line number" w:semiHidden="1" w:unhideWhenUsed="1"/>
+    <w:lsdException w:name="page number" w:semiHidden="1" w:unhideWhenUsed="1"/>
+    <w:lsdException w:name="endnote reference" w:semiHidden="1" w:unhideWhenUsed="1"/>
+    <w:lsdException w:name="endnote text" w:semiHidden="1" w:unhideWhenUsed="1"/>
+    <w:lsdException w:name="table of authorities" w:semiHidden="1" w:unhideWhenUsed="1"/>
+    <w:lsdException w:name="macro" w:semiHidden="1" w:unhideWhenUsed="1"/>
+    <w:lsdException w:name="toa heading" w:semiHidden="1" w:unhideWhenUsed="1"/>
+    <w:lsdException w:name="List" w:semiHidden="1" w:unhideWhenUsed="1"/>
+    <w:lsdException w:name="List Bullet" w:semiHidden="1" w:unhideWhenUsed="1"/>
+    <w:lsdException w:name="List Number" w:semiHidden="1" w:unhideWhenUsed="1"/>
+    <w:lsdException w:name="List 2" w:semiHidden="1" w:unhideWhenUsed="1"/>
+    <w:lsdException w:name="List 3" w:semiHidden="1" w:unhideWhenUsed="1"/>
+    <w:lsdException w:name="List 4" w:semiHidden="1" w:unhideWhenUsed="1"/>
+    <w:lsdException w:name="List 5" w:semiHidden="1" w:unhideWhenUsed="1"/>
+    <w:lsdException w:name="List Bullet 2" w:semiHidden="1" w:unhideWhenUsed="1"/>
+    <w:lsdException w:name="List Bullet 3" w:semiHidden="1" w:unhideWhenUsed="1"/>
+    <w:lsdException w:name="List Bullet 4" w:semiHidden="1" w:unhideWhenUsed="1"/>
+    <w:lsdException w:name="List Bullet 5" w:semiHidden="1" w:unhideWhenUsed="1"/>
+    <w:lsdException w:name="List Number 2" w:semiHidden="1" w:unhideWhenUsed="1"/>
+    <w:lsdException w:name="List Number 3" w:semiHidden="1" w:unhideWhenUsed="1"/>
+    <w:lsdException w:name="List Number 4" w:semiHidden="1" w:unhideWhenUsed="1"/>
+    <w:lsdException w:name="List Number 5" w:semiHidden="1" w:unhideWhenUsed="1"/>
+    <w:lsdException w:name="Title" w:uiPriority="10" w:qFormat="1"/>
+    <w:lsdException w:name="Closing" w:semiHidden="1" w:unhideWhenUsed="1"/>
+    <w:lsdException w:name="Signature" w:semiHidden="1" w:unhideWhenUsed="1"/>
+    <w:lsdException w:name="Default Paragraph Font" w:semiHidden="1" w:uiPriority="1" w:unhideWhenUsed="1"/>
+    <w:lsdException w:name="Body Text" w:semiHidden="1" w:unhideWhenUsed="1"/>
+    <w:lsdException w:name="Body Text Indent" w:semiHidden="1" w:unhideWhenUsed="1"/>
+    <w:lsdException w:name="List Continue" w:semiHidden="1" w:unhideWhenUsed="1"/>
+    <w:lsdException w:name="List Continue 2" w:semiHidden="1" w:unhideWhenUsed="1"/>
+    <w:lsdException w:name="List Continue 3" w:semiHidden="1" w:unhideWhenUsed="1"/>
+    <w:lsdException w:name="List Continue 4" w:semiHidden="1" w:unhideWhenUsed="1"/>
+    <w:lsdException w:name="List Continue 5" w:semiHidden="1" w:unhideWhenUsed="1"/>
+    <w:lsdException w:name="Message Header" w:semiHidden="1" w:unhideWhenUsed="1"/>
+    <w:lsdException w:name="Subtitle" w:uiPriority="11" w:qFormat="1"/>
+    <w:lsdException w:name="Salutation" w:semiHidden="1" w:unhideWhenUsed="1"/>
+    <w:lsdException w:name="Date" w:semiHidden="1" w:unhideWhenUsed="1"/>
+    <w:lsdException w:name="Body Text First Indent" w:semiHidden="1" w:unhideWhenUsed="1"/>
+    <w:lsdException w:name="Body Text First Indent 2" w:semiHidden="1" w:unhideWhenUsed="1"/>
+    <w:lsdException w:name="Note Heading" w:semiHidden="1" w:unhideWhenUsed="1"/>
+    <w:lsdException w:name="Body Text 2" w:semiHidden="1" w:unhideWhenUsed="1"/>
+    <w:lsdException w:name="Body Text 3" w:semiHidden="1" w:unhideWhenUsed="1"/>
+    <w:lsdException w:name="Body Text Indent 2" w:semiHidden="1" w:unhideWhenUsed="1"/>
+    <w:lsdException w:name="Body Text Indent 3" w:semiHidden="1" w:unhideWhenUsed="1"/>
+    <w:lsdException w:name="Block Text" w:semiHidden="1" w:unhideWhenUsed="1"/>
+    <w:lsdException w:name="Hyperlink" w:semiHidden="1" w:unhideWhenUsed="1"/>
+    <w:lsdException w:name="FollowedHyperlink" w:semiHidden="1" w:unhideWhenUsed="1"/>
+    <w:lsdException w:name="Strong" w:uiPriority="22" w:qFormat="1"/>
+    <w:lsdException w:name="Emphasis" w:uiPriority="20" w:qFormat="1"/>
+    <w:lsdException w:name="Document Map" w:semiHidden="1" w:unhideWhenUsed="1"/>
+    <w:lsdException w:name="Plain Text" w:semiHidden="1" w:unhideWhenUsed="1"/>
+    <w:lsdException w:name="E-mail Signature" w:semiHidden="1" w:unhideWhenUsed="1"/>
+    <w:lsdException w:name="HTML Top of Form" w:semiHidden="1" w:unhideWhenUsed="1"/>
+    <w:lsdException w:name="HTML Bottom of Form" w:semiHidden="1" w:unhideWhenUsed="1"/>
+    <w:lsdException w:name="Normal (Web)" w:semiHidden="1" w:unhideWhenUsed="1"/>
+    <w:lsdException w:name="HTML Acronym" w:semiHidden="1" w:unhideWhenUsed="1"/>
+    <w:lsdException w:name="HTML Address" w:semiHidden="1" w:unhideWhenUsed="1"/>
+    <w:lsdException w:name="HTML Cite" w:semiHidden="1" w:unhideWhenUsed="1"/>
+    <w:lsdException w:name="HTML Code" w:semiHidden="1" w:unhideWhenUsed="1"/>
+    <w:lsdException w:name="HTML Definition" w:semiHidden="1" w:unhideWhenUsed="1"/>
+    <w:lsdException w:name="HTML Keyboard" w:semiHidden="1" w:unhideWhenUsed="1"/>
+    <w:lsdException w:name="HTML Preformatted" w:semiHidden="1" w:unhideWhenUsed="1"/>
+    <w:lsdException w:name="HTML Sample" w:semiHidden="1" w:unhideWhenUsed="1"/>
+    <w:lsdException w:name="HTML Typewriter" w:semiHidden="1" w:unhideWhenUsed="1"/>
+    <w:lsdException w:name="HTML Variable" w:semiHidden="1" w:unhideWhenUsed="1"/>
+    <w:lsdException w:name="Normal Table" w:semiHidden="1" w:unhideWhenUsed="1"/>
+    <w:lsdException w:name="annotation subject" w:semiHidden="1" w:unhideWhenUsed="1"/>
+    <w:lsdException w:name="No List" w:semiHidden="1" w:unhideWhenUsed="1"/>
+    <w:lsdException w:name="Outline List 1" w:semiHidden="1" w:unhideWhenUsed="1"/>
+    <w:lsdException w:name="Outline List 2" w:semiHidden="1" w:unhideWhenUsed="1"/>
+    <w:lsdException w:name="Outline List 3" w:semiHidden="1" w:unhideWhenUsed="1"/>
+    <w:lsdException w:name="Table Simple 1" w:semiHidden="1" w:unhideWhenUsed="1"/>
+    <w:lsdException w:name="Table Simple 2" w:semiHidden="1" w:unhideWhenUsed="1"/>
+    <w:lsdException w:name="Table Simple 3" w:semiHidden="1" w:unhideWhenUsed="1"/>
+    <w:lsdException w:name="Table Classic 1" w:semiHidden="1" w:unhideWhenUsed="1"/>
+    <w:lsdException w:name="Table Classic 2" w:semiHidden="1" w:unhideWhenUsed="1"/>
+    <w:lsdException w:name="Table Classic 3" w:semiHidden="1" w:unhideWhenUsed="1"/>
+    <w:lsdException w:name="Table Classic 4" w:semiHidden="1" w:unhideWhenUsed="1"/>
+    <w:lsdException w:name="Table Colorful 1" w:semiHidden="1" w:unhideWhenUsed="1"/>
+    <w:lsdException w:name="Table Colorful 2" w:semiHidden="1" w:unhideWhenUsed="1"/>
+    <w:lsdException w:name="Table Colorful 3" w:semiHidden="1" w:unhideWhenUsed="1"/>
+    <w:lsdException w:name="Table Columns 1" w:semiHidden="1" w:unhideWhenUsed="1"/>
+    <w:lsdException w:name="Table Columns 2" w:semiHidden="1" w:unhideWhenUsed="1"/>
+    <w:lsdException w:name="Table Columns 3" w:semiHidden="1" w:unhideWhenUsed="1"/>
+    <w:lsdException w:name="Table Columns 4" w:semiHidden="1" w:unhideWhenUsed="1"/>
+    <w:lsdException w:name="Table Columns 5" w:semiHidden="1" w:unhideWhenUsed="1"/>
+    <w:lsdException w:name="Table Grid 1" w:semiHidden="1" w:unhideWhenUsed="1"/>
+    <w:lsdException w:name="Table Grid 2" w:semiHidden="1" w:unhideWhenUsed="1"/>
+    <w:lsdException w:name="Table Grid 3" w:semiHidden="1" w:unhideWhenUsed="1"/>
+    <w:lsdException w:name="Table Grid 4" w:semiHidden="1" w:unhideWhenUsed="1"/>
+    <w:lsdException w:name="Table Grid 5" w:semiHidden="1" w:unhideWhenUsed="1"/>
+    <w:lsdException w:name="Table Grid 6" w:semiHidden="1" w:unhideWhenUsed="1"/>
+    <w:lsdException w:name="Table Grid 7" w:semiHidden="1" w:unhideWhenUsed="1"/>
+    <w:lsdException w:name="Table Grid 8" w:semiHidden="1" w:unhideWhenUsed="1"/>
+    <w:lsdException w:name="Table List 1" w:semiHidden="1" w:unhideWhenUsed="1"/>
+    <w:lsdException w:name="Table List 2" w:semiHidden="1" w:unhideWhenUsed="1"/>
+    <w:lsdException w:name="Table List 3" w:semiHidden="1" w:unhideWhenUsed="1"/>
+    <w:lsdException w:name="Table List 4" w:semiHidden="1" w:unhideWhenUsed="1"/>
+    <w:lsdException w:name="Table List 5" w:semiHidden="1" w:unhideWhenUsed="1"/>
+    <w:lsdException w:name="Table List 6" w:semiHidden="1" w:unhideWhenUsed="1"/>
+    <w:lsdException w:name="Table List 7" w:semiHidden="1" w:unhideWhenUsed="1"/>
+    <w:lsdException w:name="Table List 8" w:semiHidden="1" w:unhideWhenUsed="1"/>
+    <w:lsdException w:name="Table 3D effects 1" w:semiHidden="1" w:unhideWhenUsed="1"/>
+    <w:lsdException w:name="Table 3D effects 2" w:semiHidden="1" w:unhideWhenUsed="1"/>
+    <w:lsdException w:name="Table 3D effects 3" w:semiHidden="1" w:unhideWhenUsed="1"/>
+    <w:lsdException w:name="Table Contemporary" w:semiHidden="1" w:unhideWhenUsed="1"/>
+    <w:lsdException w:name="Table Elegant" w:semiHidden="1" w:unhideWhenUsed="1"/>
+    <w:lsdException w:name="Table Professional" w:semiHidden="1" w:unhideWhenUsed="1"/>
+    <w:lsdException w:name="Table Subtle 1" w:semiHidden="1" w:unhideWhenUsed="1"/>
+    <w:lsdException w:name="Table Subtle 2" w:semiHidden="1" w:unhideWhenUsed="1"/>
+    <w:lsdException w:name="Table Web 1" w:semiHidden="1" w:unhideWhenUsed="1"/>
+    <w:lsdException w:name="Table Web 2" w:semiHidden="1" w:unhideWhenUsed="1"/>
+    <w:lsdException w:name="Table Web 3" w:semiHidden="1" w:unhideWhenUsed="1"/>
+    <w:lsdException w:name="Balloon Text" w:semiHidden="1" w:unhideWhenUsed="1"/>
+    <w:lsdException w:name="Table Grid" w:uiPriority="39"/>
+    <w:lsdException w:name="Table Theme" w:semiHidden="1" w:unhideWhenUsed="1"/>
+    <w:lsdException w:name="Placeholder Text" w:semiHidden="1"/>
+    <w:lsdException w:name="No Spacing" w:uiPriority="1" w:qFormat="1"/>
+    <w:lsdException w:name="Light Shading" w:uiPriority="60"/>
+    <w:lsdException w:name="Light List" w:uiPriority="61"/>
+    <w:lsdException w:name="Light Grid" w:uiPriority="62"/>
+    <w:lsdException w:name="Medium Shading 1" w:uiPriority="63"/>
+    <w:lsdException w:name="Medium Shading 2" w:uiPriority="64"/>
+    <w:lsdException w:name="Medium List 1" w:uiPriority="65"/>
+    <w:lsdException w:name="Medium List 2" w:uiPriority="66"/>
+    <w:lsdException w:name="Medium Grid 1" w:uiPriority="67"/>
+    <w:lsdException w:name="Medium Grid 2" w:uiPriority="68"/>
+    <w:lsdException w:name="Medium Grid 3" w:uiPriority="69"/>
+    <w:lsdException w:name="Dark List" w:uiPriority="70"/>
+    <w:lsdException w:name="Colorful Shading" w:uiPriority="71"/>
+    <w:lsdException w:name="Colorful List" w:uiPriority="72"/>
+    <w:lsdException w:name="Colorful Grid" w:uiPriority="73"/>
+    <w:lsdException w:name="Light Shading Accent 1" w:uiPriority="60"/>
+    <w:lsdException w:name="Light List Accent 1" w:uiPriority="61"/>
+    <w:lsdException w:name="Light Grid Accent 1" w:uiPriority="62"/>
+    <w:lsdException w:name="Medium Shading 1 Accent 1" w:uiPriority="63"/>
+    <w:lsdException w:name="Medium Shading 2 Accent 1" w:uiPriority="64"/>
+    <w:lsdException w:name="Medium List 1 Accent 1" w:uiPriority="65"/>
+    <w:lsdException w:name="Revision" w:semiHidden="1"/>
+    <w:lsdException w:name="List Paragraph" w:uiPriority="34" w:qFormat="1"/>
+    <w:lsdException w:name="Quote" w:uiPriority="29" w:qFormat="1"/>
+    <w:lsdException w:name="Intense Quote" w:uiPriority="30" w:qFormat="1"/>
+    <w:lsdException w:name="Medium List 2 Accent 1" w:uiPriority="66"/>
+    <w:lsdException w:name="Medium Grid 1 Accent 1" w:uiPriority="67"/>
+    <w:lsdException w:name="Medium Grid 2 Accent 1" w:uiPriority="68"/>
+    <w:lsdException w:name="Medium Grid 3 Accent 1" w:uiPriority="69"/>
+    <w:lsdException w:name="Dark List Accent 1" w:uiPriority="70"/>
+    <w:lsdException w:name="Colorful Shading Accent 1" w:uiPriority="71"/>
+    <w:lsdException w:name="Colorful List Accent 1" w:uiPriority="72"/>
+    <w:lsdException w:name="Colorful Grid Accent 1" w:uiPriority="73"/>
+    <w:lsdException w:name="Light Shading Accent 2" w:uiPriority="60"/>
+    <w:lsdException w:name="Light List Accent 2" w:uiPriority="61"/>
+    <w:lsdException w:name="Light Grid Accent 2" w:uiPriority="62"/>
+    <w:lsdException w:name="Medium Shading 1 Accent 2" w:uiPriority="63"/>
+    <w:lsdException w:name="Medium Shading 2 Accent 2" w:uiPriority="64"/>
+    <w:lsdException w:name="Medium List 1 Accent 2" w:uiPriority="65"/>
+    <w:lsdException w:name="Medium List 2 Accent 2" w:uiPriority="66"/>
+    <w:lsdException w:name="Medium Grid 1 Accent 2" w:uiPriority="67"/>
+    <w:lsdException w:name="Medium Grid 2 Accent 2" w:uiPriority="68"/>
+    <w:lsdException w:name="Medium Grid 3 Accent 2" w:uiPriority="69"/>
+    <w:lsdException w:name="Dark List Accent 2" w:uiPriority="70"/>
+    <w:lsdException w:name="Colorful Shading Accent 2" w:uiPriority="71"/>
+    <w:lsdException w:name="Colorful List Accent 2" w:uiPriority="72"/>
+    <w:lsdException w:name="Colorful Grid Accent 2" w:uiPriority="73"/>
+    <w:lsdException w:name="Light Shading Accent 3" w:uiPriority="60"/>
+    <w:lsdException w:name="Light List Accent 3" w:uiPriority="61"/>
+    <w:lsdException w:name="Light Grid Accent 3" w:uiPriority="62"/>
+    <w:lsdException w:name="Medium Shading 1 Accent 3" w:uiPriority="63"/>
+    <w:lsdException w:name="Medium Shading 2 Accent 3" w:uiPriority="64"/>
+    <w:lsdException w:name="Medium List 1 Accent 3" w:uiPriority="65"/>
+    <w:lsdException w:name="Medium List 2 Accent 3" w:uiPriority="66"/>
+    <w:lsdException w:name="Medium Grid 1 Accent 3" w:uiPriority="67"/>
+    <w:lsdException w:name="Medium Grid 2 Accent 3" w:uiPriority="68"/>
+    <w:lsdException w:name="Medium Grid 3 Accent 3" w:uiPriority="69"/>
+    <w:lsdException w:name="Dark List Accent 3" w:uiPriority="70"/>
+    <w:lsdException w:name="Colorful Shading Accent 3" w:uiPriority="71"/>
+    <w:lsdException w:name="Colorful List Accent 3" w:uiPriority="72"/>
+    <w:lsdException w:name="Colorful Grid Accent 3" w:uiPriority="73"/>
+    <w:lsdException w:name="Light Shading Accent 4" w:uiPriority="60"/>
+    <w:lsdException w:name="Light List Accent 4" w:uiPriority="61"/>
+    <w:lsdException w:name="Light Grid Accent 4" w:uiPriority="62"/>
+    <w:lsdException w:name="Medium Shading 1 Accent 4" w:uiPriority="63"/>
+    <w:lsdException w:name="Medium Shading 2 Accent 4" w:uiPriority="64"/>
+    <w:lsdException w:name="Medium List 1 Accent 4" w:uiPriority="65"/>
+    <w:lsdException w:name="Medium List 2 Accent 4" w:uiPriority="66"/>
+    <w:lsdException w:name="Medium Grid 1 Accent 4" w:uiPriority="67"/>
+    <w:lsdException w:name="Medium Grid 2 Accent 4" w:uiPriority="68"/>
+    <w:lsdException w:name="Medium Grid 3 Accent 4" w:uiPriority="69"/>
+    <w:lsdException w:name="Dark List Accent 4" w:uiPriority="70"/>
+    <w:lsdException w:name="Colorful Shading Accent 4" w:uiPriority="71"/>
+    <w:lsdException w:name="Colorful List Accent 4" w:uiPriority="72"/>
+    <w:lsdException w:name="Colorful Grid Accent 4" w:uiPriority="73"/>
+    <w:lsdException w:name="Light Shading Accent 5" w:uiPriority="60"/>
+    <w:lsdException w:name="Light List Accent 5" w:uiPriority="61"/>
+    <w:lsdException w:name="Light Grid Accent 5" w:uiPriority="62"/>
+    <w:lsdException w:name="Medium Shading 1 Accent 5" w:uiPriority="63"/>
+    <w:lsdException w:name="Medium Shading 2 Accent 5" w:uiPriority="64"/>
+    <w:lsdException w:name="Medium List 1 Accent 5" w:uiPriority="65"/>
+    <w:lsdException w:name="Medium List 2 Accent 5" w:uiPriority="66"/>
+    <w:lsdException w:name="Medium Grid 1 Accent 5" w:uiPriority="67"/>
+    <w:lsdException w:name="Medium Grid 2 Accent 5" w:uiPriority="68"/>
+    <w:lsdException w:name="Medium Grid 3 Accent 5" w:uiPriority="69"/>
+    <w:lsdException w:name="Dark List Accent 5" w:uiPriority="70"/>
+    <w:lsdException w:name="Colorful Shading Accent 5" w:uiPriority="71"/>
+    <w:lsdException w:name="Colorful List Accent 5" w:uiPriority="72"/>
+    <w:lsdException w:name="Colorful Grid Accent 5" w:uiPriority="73"/>
+    <w:lsdException w:name="Light Shading Accent 6" w:uiPriority="60"/>
+    <w:lsdException w:name="Light List Accent 6" w:uiPriority="61"/>
+    <w:lsdException w:name="Light Grid Accent 6" w:uiPriority="62"/>
+    <w:lsdException w:name="Medium Shading 1 Accent 6" w:uiPriority="63"/>
+    <w:lsdException w:name="Medium Shading 2 Accent 6" w:uiPriority="64"/>
+    <w:lsdException w:name="Medium List 1 Accent 6" w:uiPriority="65"/>
+    <w:lsdException w:name="Medium List 2 Accent 6" w:uiPriority="66"/>
+    <w:lsdException w:name="Medium Grid 1 Accent 6" w:uiPriority="67"/>
+    <w:lsdException w:name="Medium Grid 2 Accent 6" w:uiPriority="68"/>
+    <w:lsdException w:name="Medium Grid 3 Accent 6" w:uiPriority="69"/>
+    <w:lsdException w:name="Dark List Accent 6" w:uiPriority="70"/>
+    <w:lsdException w:name="Colorful Shading Accent 6" w:uiPriority="71"/>
+    <w:lsdException w:name="Colorful List Accent 6" w:uiPriority="72"/>
+    <w:lsdException w:name="Colorful Grid Accent 6" w:uiPriority="73"/>
+    <w:lsdException w:name="Subtle Emphasis" w:uiPriority="19" w:qFormat="1"/>
+    <w:lsdException w:name="Intense Emphasis" w:uiPriority="21" w:qFormat="1"/>
+    <w:lsdException w:name="Subtle Reference" w:uiPriority="31" w:qFormat="1"/>
+    <w:lsdException w:name="Intense Reference" w:uiPriority="32" w:qFormat="1"/>
+    <w:lsdException w:name="Book Title" w:uiPriority="33" w:qFormat="1"/>
+    <w:lsdException w:name="Bibliography" w:semiHidden="1" w:uiPriority="37" w:unhideWhenUsed="1"/>
+    <w:lsdException w:name="TOC Heading" w:semiHidden="1" w:uiPriority="39" w:unhideWhenUsed="1" w:qFormat="1"/>
+    <w:lsdException w:name="Plain Table 1" w:uiPriority="41"/>
+    <w:lsdException w:name="Plain Table 2" w:uiPriority="42"/>
+    <w:lsdException w:name="Plain Table 3" w:uiPriority="43"/>
+    <w:lsdException w:name="Plain Table 4" w:uiPriority="44"/>
+    <w:lsdException w:name="Plain Table 5" w:uiPriority="45"/>
+    <w:lsdException w:name="Grid Table Light" w:uiPriority="40"/>
+    <w:lsdException w:name="Grid Table 1 Light" w:uiPriority="46"/>
+    <w:lsdException w:name="Grid Table 2" w:uiPriority="47"/>
+    <w:lsdException w:name="Grid Table 3" w:uiPriority="48"/>
+    <w:lsdException w:name="Grid Table 4" w:uiPriority="49"/>
+    <w:lsdException w:name="Grid Table 5 Dark" w:uiPriority="50"/>
+    <w:lsdException w:name="Grid Table 6 Colorful" w:uiPriority="51"/>
+    <w:lsdException w:name="Grid Table 7 Colorful" w:uiPriority="52"/>
+    <w:lsdException w:name="Grid Table 1 Light Accent 1" w:uiPriority="46"/>
+    <w:lsdException w:name="Grid Table 2 Accent 1" w:uiPriority="47"/>
+    <w:lsdException w:name="Grid Table 3 Accent 1" w:uiPriority="48"/>
+    <w:lsdException w:name="Grid Table 4 Accent 1" w:uiPriority="49"/>
+    <w:lsdException w:name="Grid Table 5 Dark Accent 1" w:uiPriority="50"/>
+    <w:lsdException w:name="Grid Table 6 Colorful Accent 1" w:uiPriority="51"/>
+    <w:lsdException w:name="Grid Table 7 Colorful Accent 1" w:uiPriority="52"/>
+    <w:lsdException w:name="Grid Table 1 Light Accent 2" w:uiPriority="46"/>
+    <w:lsdException w:name="Grid Table 2 Accent 2" w:uiPriority="47"/>
+    <w:lsdException w:name="Grid Table 3 Accent 2" w:uiPriority="48"/>
+    <w:lsdException w:name="Grid Table 4 Accent 2" w:uiPriority="49"/>
+    <w:lsdException w:name="Grid Table 5 Dark Accent 2" w:uiPriority="50"/>
+    <w:lsdException w:name="Grid Table 6 Colorful Accent 2" w:uiPriority="51"/>
+    <w:lsdException w:name="Grid Table 7 Colorful Accent 2" w:uiPriority="52"/>
+    <w:lsdException w:name="Grid Table 1 Light Accent 3" w:uiPriority="46"/>
+    <w:lsdException w:name="Grid Table 2 Accent 3" w:uiPriority="47"/>
+    <w:lsdException w:name="Grid Table 3 Accent 3" w:uiPriority="48"/>
+    <w:lsdException w:name="Grid Table 4 Accent 3" w:uiPriority="49"/>
+    <w:lsdException w:name="Grid Table 5 Dark Accent 3" w:uiPriority="50"/>
+    <w:lsdException w:name="Grid Table 6 Colorful Accent 3" w:uiPriority="51"/>
+    <w:lsdException w:name="Grid Table 7 Colorful Accent 3" w:uiPriority="52"/>
+    <w:lsdException w:name="Grid Table 1 Light Accent 4" w:uiPriority="46"/>
+    <w:lsdException w:name="Grid Table 2 Accent 4" w:uiPriority="47"/>
+    <w:lsdException w:name="Grid Table 3 Accent 4" w:uiPriority="48"/>
+    <w:lsdException w:name="Grid Table 4 Accent 4" w:uiPriority="49"/>
+    <w:lsdException w:name="Grid Table 5 Dark Accent 4" w:uiPriority="50"/>
+    <w:lsdException w:name="Grid Table 6 Colorful Accent 4" w:uiPriority="51"/>
+    <w:lsdException w:name="Grid Table 7 Colorful Accent 4" w:uiPriority="52"/>
+    <w:lsdException w:name="Grid Table 1 Light Accent 5" w:uiPriority="46"/>
+    <w:lsdException w:name="Grid Table 2 Accent 5" w:uiPriority="47"/>
+    <w:lsdException w:name="Grid Table 3 Accent 5" w:uiPriority="48"/>
+    <w:lsdException w:name="Grid Table 4 Accent 5" w:uiPriority="49"/>
+    <w:lsdException w:name="Grid Table 5 Dark Accent 5" w:uiPriority="50"/>
+    <w:lsdException w:name="Grid Table 6 Colorful Accent 5" w:uiPriority="51"/>
+    <w:lsdException w:name="Grid Table 7 Colorful Accent 5" w:uiPriority="52"/>
+    <w:lsdException w:name="Grid Table 1 Light Accent 6" w:uiPriority="46"/>
+    <w:lsdException w:name="Grid Table 2 Accent 6" w:uiPriority="47"/>
+    <w:lsdException w:name="Grid Table 3 Accent 6" w:uiPriority="48"/>
+    <w:lsdException w:name="Grid Table 4 Accent 6" w:uiPriority="49"/>
+    <w:lsdException w:name="Grid Table 5 Dark Accent 6" w:uiPriority="50"/>
+    <w:lsdException w:name="Grid Table 6 Colorful Accent 6" w:uiPriority="51"/>
+    <w:lsdException w:name="Grid Table 7 Colorful Accent 6" w:uiPriority="52"/>
+    <w:lsdException w:name="List Table 1 Light" w:uiPriority="46"/>
+    <w:lsdException w:name="List Table 2" w:uiPriority="47"/>
+    <w:lsdException w:name="List Table 3" w:uiPriority="48"/>
+    <w:lsdException w:name="List Table 4" w:uiPriority="49"/>
+    <w:lsdException w:name="List Table 5 Dark" w:uiPriority="50"/>
+    <w:lsdException w:name="List Table 6 Colorful" w:uiPriority="51"/>
+    <w:lsdException w:name="List Table 7 Colorful" w:uiPriority="52"/>
+    <w:lsdException w:name="List Table 1 Light Accent 1" w:uiPriority="46"/>
+    <w:lsdException w:name="List Table 2 Accent 1" w:uiPriority="47"/>
+    <w:lsdException w:name="List Table 3 Accent 1" w:uiPriority="48"/>
+    <w:lsdException w:name="List Table 4 Accent 1" w:uiPriority="49"/>
+    <w:lsdException w:name="List Table 5 Dark Accent 1" w:uiPriority="50"/>
+    <w:lsdException w:name="List Table 6 Colorful Accent 1" w:uiPriority="51"/>
+    <w:lsdException w:name="List Table 7 Colorful Accent 1" w:uiPriority="52"/>
+    <w:lsdException w:name="List Table 1 Light Accent 2" w:uiPriority="46"/>
+    <w:lsdException w:name="List Table 2 Accent 2" w:uiPriority="47"/>
+    <w:lsdException w:name="List Table 3 Accent 2" w:uiPriority="48"/>
+    <w:lsdException w:name="List Table 4 Accent 2" w:uiPriority="49"/>
+    <w:lsdException w:name="List Table 5 Dark Accent 2" w:uiPriority="50"/>
+    <w:lsdException w:name="List Table 6 Colorful Accent 2" w:uiPriority="51"/>
+    <w:lsdException w:name="List Table 7 Colorful Accent 2" w:uiPriority="52"/>
+    <w:lsdException w:name="List Table 1 Light Accent 3" w:uiPriority="46"/>
+    <w:lsdException w:name="List Table 2 Accent 3" w:uiPriority="47"/>
+    <w:lsdException w:name="List Table 3 Accent 3" w:uiPriority="48"/>
+    <w:lsdException w:name="List Table 4 Accent 3" w:uiPriority="49"/>
+    <w:lsdException w:name="List Table 5 Dark Accent 3" w:uiPriority="50"/>
+    <w:lsdException w:name="List Table 6 Colorful Accent 3" w:uiPriority="51"/>
+    <w:lsdException w:name="List Table 7 Colorful Accent 3" w:uiPriority="52"/>
+    <w:lsdException w:name="List Table 1 Light Accent 4" w:uiPriority="46"/>
+    <w:lsdException w:name="List Table 2 Accent 4" w:uiPriority="47"/>
+    <w:lsdException w:name="List Table 3 Accent 4" w:uiPriority="48"/>
+    <w:lsdException w:name="List Table 4 Accent 4" w:uiPriority="49"/>
+    <w:lsdException w:name="List Table 5 Dark Accent 4" w:uiPriority="50"/>
+    <w:lsdException w:name="List Table 6 Colorful Accent 4" w:uiPriority="51"/>
+    <w:lsdException w:name="List Table 7 Colorful Accent 4" w:uiPriority="52"/>
+    <w:lsdException w:name="List Table 1 Light Accent 5" w:uiPriority="46"/>
+    <w:lsdException w:name="List Table 2 Accent 5" w:uiPriority="47"/>
+    <w:lsdException w:name="List Table 3 Accent 5" w:uiPriority="48"/>
+    <w:lsdException w:name="List Table 4 Accent 5" w:uiPriority="49"/>
+    <w:lsdException w:name="List Table 5 Dark Accent 5" w:uiPriority="50"/>
+    <w:lsdException w:name="List Table 6 Colorful Accent 5" w:uiPriority="51"/>
+    <w:lsdException w:name="List Table 7 Colorful Accent 5" w:uiPriority="52"/>
+    <w:lsdException w:name="List Table 1 Light Accent 6" w:uiPriority="46"/>
+    <w:lsdException w:name="List Table 2 Accent 6" w:uiPriority="47"/>
+    <w:lsdException w:name="List Table 3 Accent 6" w:uiPriority="48"/>
+    <w:lsdException w:name="List Table 4 Accent 6" w:uiPriority="49"/>
+    <w:lsdException w:name="List Table 5 Dark Accent 6" w:uiPriority="50"/>
+    <w:lsdException w:name="List Table 6 Colorful Accent 6" w:uiPriority="51"/>
+    <w:lsdException w:name="List Table 7 Colorful Accent 6" w:uiPriority="52"/>
+    <w:lsdException w:name="Mention" w:semiHidden="1" w:unhideWhenUsed="1"/>
+    <w:lsdException w:name="Smart Hyperlink" w:semiHidden="1" w:unhideWhenUsed="1"/>
+    <w:lsdException w:name="Hashtag" w:semiHidden="1" w:unhideWhenUsed="1"/>
+    <w:lsdException w:name="Unresolved Mention" w:semiHidden="1" w:unhideWhenUsed="1"/>
+    <w:lsdException w:name="Smart Link" w:semiHidden="1" w:unhideWhenUsed="1"/>
+  </w:latentStyles>
+  <w:style w:type="paragraph" w:default="1" w:styleId="Normal">
+    <w:name w:val="Normal"/>
     <w:qFormat/>
-    <w:rPr>
-      <w:sz w:val="56"/>
-      <w:szCs w:val="56"/>
-    </w:rPr>
   </w:style>
   <w:style w:type="paragraph" w:styleId="Heading1">
-    <w:name w:val="Heading 1"/>
-    <w:basedOn w:val="Normal"/>
-    <w:next w:val="Normal"/>
+    <w:name w:val="heading 1"/>
+    <w:uiPriority w:val="9"/>
     <w:qFormat/>
+    <w:pPr>
+      <w:spacing w:before="240" w:after="120"/>
+      <w:outlineLvl w:val="0"/>
+    </w:pPr>
     <w:rPr>
-      <w:color w:val="2E74B5"/>
+      <w:b/>
+      <w:bCs/>
+      <w:color w:val="2E5C8A"/>
       <w:sz w:val="32"/>
       <w:szCs w:val="32"/>
     </w:rPr>
   </w:style>
   <w:style w:type="paragraph" w:styleId="Heading2">
-    <w:name w:val="Heading 2"/>
-    <w:basedOn w:val="Normal"/>
-    <w:next w:val="Normal"/>
+    <w:name w:val="heading 2"/>
+    <w:uiPriority w:val="9"/>
+    <w:unhideWhenUsed/>
     <w:qFormat/>
+    <w:pPr>
+      <w:spacing w:before="180" w:after="100"/>
+      <w:outlineLvl w:val="1"/>
+    </w:pPr>
     <w:rPr>
-      <w:color w:val="2E74B5"/>
-      <w:sz w:val="26"/>
-      <w:szCs w:val="26"/>
+      <w:b/>
+      <w:bCs/>
+      <w:color w:val="2E5C8A"/>
+      <w:sz w:val="28"/>
+      <w:szCs w:val="28"/>
     </w:rPr>
   </w:style>
   <w:style w:type="paragraph" w:styleId="Heading3">
-    <w:name w:val="Heading 3"/>
-    <w:basedOn w:val="Normal"/>
-    <w:next w:val="Normal"/>
+    <w:name w:val="heading 3"/>
+    <w:uiPriority w:val="9"/>
+    <w:unhideWhenUsed/>
     <w:qFormat/>
+    <w:pPr>
+      <w:spacing w:before="120" w:after="80"/>
+      <w:outlineLvl w:val="2"/>
+    </w:pPr>
     <w:rPr>
-      <w:color w:val="1F4D78"/>
-      <w:sz w:val="24"/>
-      <w:szCs w:val="24"/>
+      <w:b/>
+      <w:bCs/>
+      <w:color w:val="374151"/>
     </w:rPr>
   </w:style>
   <w:style w:type="paragraph" w:styleId="Heading4">
-    <w:name w:val="Heading 4"/>
-    <w:basedOn w:val="Normal"/>
-    <w:next w:val="Normal"/>
+    <w:name w:val="heading 4"/>
+    <w:uiPriority w:val="9"/>
+    <w:semiHidden/>
+    <w:unhideWhenUsed/>
     <w:qFormat/>
+    <w:pPr>
+      <w:outlineLvl w:val="3"/>
+    </w:pPr>
     <w:rPr>
       <w:i/>
       <w:iCs/>
@@ -1527,27 +2404,69 @@
     </w:rPr>
   </w:style>
   <w:style w:type="paragraph" w:styleId="Heading5">
-    <w:name w:val="Heading 5"/>
-    <w:basedOn w:val="Normal"/>
-    <w:next w:val="Normal"/>
+    <w:name w:val="heading 5"/>
+    <w:uiPriority w:val="9"/>
+    <w:semiHidden/>
+    <w:unhideWhenUsed/>
     <w:qFormat/>
+    <w:pPr>
+      <w:outlineLvl w:val="4"/>
+    </w:pPr>
     <w:rPr>
       <w:color w:val="2E74B5"/>
     </w:rPr>
   </w:style>
   <w:style w:type="paragraph" w:styleId="Heading6">
-    <w:name w:val="Heading 6"/>
-    <w:basedOn w:val="Normal"/>
-    <w:next w:val="Normal"/>
+    <w:name w:val="heading 6"/>
+    <w:uiPriority w:val="9"/>
+    <w:semiHidden/>
+    <w:unhideWhenUsed/>
     <w:qFormat/>
+    <w:pPr>
+      <w:outlineLvl w:val="5"/>
+    </w:pPr>
     <w:rPr>
       <w:color w:val="1F4D78"/>
     </w:rPr>
   </w:style>
-  <w:style w:type="paragraph" w:styleId="Strong">
-    <w:name w:val="Strong"/>
-    <w:basedOn w:val="Normal"/>
-    <w:next w:val="Normal"/>
+  <w:style w:type="character" w:default="1" w:styleId="DefaultParagraphFont">
+    <w:name w:val="Default Paragraph Font"/>
+    <w:uiPriority w:val="1"/>
+    <w:semiHidden/>
+    <w:unhideWhenUsed/>
+  </w:style>
+  <w:style w:type="table" w:default="1" w:styleId="TableNormal">
+    <w:name w:val="Normal Table"/>
+    <w:uiPriority w:val="99"/>
+    <w:semiHidden/>
+    <w:unhideWhenUsed/>
+    <w:tblPr>
+      <w:tblInd w:w="0" w:type="dxa"/>
+      <w:tblCellMar>
+        <w:top w:w="0" w:type="dxa"/>
+        <w:left w:w="108" w:type="dxa"/>
+        <w:bottom w:w="0" w:type="dxa"/>
+        <w:right w:w="108" w:type="dxa"/>
+      </w:tblCellMar>
+    </w:tblPr>
+  </w:style>
+  <w:style w:type="numbering" w:default="1" w:styleId="NoList">
+    <w:name w:val="No List"/>
+    <w:uiPriority w:val="99"/>
+    <w:semiHidden/>
+    <w:unhideWhenUsed/>
+  </w:style>
+  <w:style w:type="paragraph" w:styleId="Title">
+    <w:name w:val="Title"/>
+    <w:uiPriority w:val="10"/>
+    <w:qFormat/>
+    <w:rPr>
+      <w:sz w:val="56"/>
+      <w:szCs w:val="56"/>
+    </w:rPr>
+  </w:style>
+  <w:style w:type="paragraph" w:customStyle="1" w:styleId="Strong1">
+    <w:name w:val="Strong1"/>
     <w:qFormat/>
     <w:rPr>
       <w:b/>
@@ -1556,12 +2475,10 @@
   </w:style>
   <w:style w:type="paragraph" w:styleId="ListParagraph">
     <w:name w:val="List Paragraph"/>
-    <w:basedOn w:val="Normal"/>
     <w:qFormat/>
   </w:style>
   <w:style w:type="character" w:styleId="Hyperlink">
     <w:name w:val="Hyperlink"/>
-    <w:basedOn w:val="DefaultParagraphFont"/>
     <w:uiPriority w:val="99"/>
     <w:unhideWhenUsed/>
     <w:rPr>
@@ -1571,7 +2488,6 @@
   </w:style>
   <w:style w:type="character" w:styleId="FootnoteReference">
     <w:name w:val="footnote reference"/>
-    <w:basedOn w:val="DefaultParagraphFont"/>
     <w:uiPriority w:val="99"/>
     <w:semiHidden/>
     <w:unhideWhenUsed/>
@@ -1581,22 +2497,17 @@
   </w:style>
   <w:style w:type="paragraph" w:styleId="FootnoteText">
     <w:name w:val="footnote text"/>
-    <w:basedOn w:val="Normal"/>
     <w:link w:val="FootnoteTextChar"/>
     <w:uiPriority w:val="99"/>
     <w:semiHidden/>
     <w:unhideWhenUsed/>
-    <w:pPr>
-      <w:spacing w:after="0" w:line="240" w:lineRule="auto"/>
-    </w:pPr>
     <w:rPr>
       <w:sz w:val="20"/>
       <w:szCs w:val="20"/>
     </w:rPr>
   </w:style>
-  <w:style w:type="character" w:styleId="FootnoteTextChar">
+  <w:style w:type="character" w:customStyle="1" w:styleId="FootnoteTextChar">
     <w:name w:val="Footnote Text Char"/>
-    <w:basedOn w:val="DefaultParagraphFont"/>
     <w:link w:val="FootnoteText"/>
     <w:uiPriority w:val="99"/>
     <w:semiHidden/>
@@ -1606,59 +2517,341 @@
       <w:szCs w:val="20"/>
     </w:rPr>
   </w:style>
-  <w:style w:type="paragraph" w:styleId="Heading1">
-    <w:name w:val="Heading 1"/>
+  <w:style w:type="paragraph" w:styleId="Footer">
+    <w:name w:val="footer"/>
     <w:basedOn w:val="Normal"/>
-    <w:next w:val="Normal"/>
-    <w:qFormat/>
+    <w:link w:val="FooterChar"/>
+    <w:uiPriority w:val="99"/>
+    <w:unhideWhenUsed/>
+    <w:rsid w:val="00C96F75"/>
     <w:pPr>
-      <w:spacing w:before="240" w:after="120"/>
-      <w:outlineLvl w:val="0"/>
+      <w:tabs>
+        <w:tab w:val="center" w:pos="4680"/>
+        <w:tab w:val="right" w:pos="9360"/>
+      </w:tabs>
     </w:pPr>
-    <w:rPr>
-      <w:rFonts w:ascii="Arial" w:cs="Arial" w:eastAsia="Arial" w:hAnsi="Arial"/>
-      <w:b/>
-      <w:bCs/>
-      <w:color w:val="2E5C8A"/>
-      <w:sz w:val="32"/>
-      <w:szCs w:val="32"/>
-    </w:rPr>
   </w:style>
-  <w:style w:type="paragraph" w:styleId="Heading2">
-    <w:name w:val="Heading 2"/>
-    <w:basedOn w:val="Normal"/>
-    <w:next w:val="Normal"/>
-    <w:qFormat/>
-    <w:pPr>
-      <w:spacing w:before="180" w:after="100"/>
-      <w:outlineLvl w:val="1"/>
-    </w:pPr>
-    <w:rPr>
-      <w:rFonts w:ascii="Arial" w:cs="Arial" w:eastAsia="Arial" w:hAnsi="Arial"/>
-      <w:b/>
-      <w:bCs/>
-      <w:color w:val="2E5C8A"/>
-      <w:sz w:val="28"/>
-      <w:szCs w:val="28"/>
-    </w:rPr>
-  </w:style>
-  <w:style w:type="paragraph" w:styleId="Heading3">
-    <w:name w:val="Heading 3"/>
-    <w:basedOn w:val="Normal"/>
-    <w:next w:val="Normal"/>
-    <w:qFormat/>
-    <w:pPr>
-      <w:spacing w:before="120" w:after="80"/>
-      <w:outlineLvl w:val="2"/>
-    </w:pPr>
-    <w:rPr>
-      <w:rFonts w:ascii="Arial" w:cs="Arial" w:eastAsia="Arial" w:hAnsi="Arial"/>
-      <w:b/>
-      <w:bCs/>
-      <w:color w:val="374151"/>
-      <w:sz w:val="24"/>
-      <w:szCs w:val="24"/>
-    </w:rPr>
+  <w:style w:type="character" w:customStyle="1" w:styleId="FooterChar">
+    <w:name w:val="Footer Char"/>
+    <w:basedOn w:val="DefaultParagraphFont"/>
+    <w:link w:val="Footer"/>
+    <w:uiPriority w:val="99"/>
+    <w:rsid w:val="00C96F75"/>
   </w:style>
 </w:styles>
+</file>
+
+<file path=word/theme/theme1.xml><?xml version="1.0" encoding="utf-8"?>
+<a:theme xmlns:a="http://schemas.openxmlformats.org/drawingml/2006/main" name="Office Theme">
+  <a:themeElements>
+    <a:clrScheme name="Office">
+      <a:dk1>
+        <a:sysClr val="windowText" lastClr="000000"/>
+      </a:dk1>
+      <a:lt1>
+        <a:sysClr val="window" lastClr="FFFFFF"/>
+      </a:lt1>
+      <a:dk2>
+        <a:srgbClr val="0E2841"/>
+      </a:dk2>
+      <a:lt2>
+        <a:srgbClr val="E8E8E8"/>
+      </a:lt2>
+      <a:accent1>
+        <a:srgbClr val="156082"/>
+      </a:accent1>
+      <a:accent2>
+        <a:srgbClr val="E97132"/>
+      </a:accent2>
+      <a:accent3>
+        <a:srgbClr val="196B24"/>
+      </a:accent3>
+      <a:accent4>
+        <a:srgbClr val="0F9ED5"/>
+      </a:accent4>
+      <a:accent5>
+        <a:srgbClr val="A02B93"/>
+      </a:accent5>
+      <a:accent6>
+        <a:srgbClr val="4EA72E"/>
+      </a:accent6>
+      <a:hlink>
+        <a:srgbClr val="467886"/>
+      </a:hlink>
+      <a:folHlink>
+        <a:srgbClr val="96607D"/>
+      </a:folHlink>
+    </a:clrScheme>
+    <a:fontScheme name="Office">
+      <a:majorFont>
+        <a:latin typeface="Aptos Display" panose="02110004020202020204"/>
+        <a:ea typeface=""/>
+        <a:cs typeface=""/>
+        <a:font script="Jpan" typeface="游ゴシック Light"/>
+        <a:font script="Hang" typeface="맑은 고딕"/>
+        <a:font script="Hans" typeface="等线 Light"/>
+        <a:font script="Hant" typeface="新細明體"/>
+        <a:font script="Arab" typeface="Times New Roman"/>
+        <a:font script="Hebr" typeface="Times New Roman"/>
+        <a:font script="Thai" typeface="Angsana New"/>
+        <a:font script="Ethi" typeface="Nyala"/>
+        <a:font script="Beng" typeface="Vrinda"/>
+        <a:font script="Gujr" typeface="Shruti"/>
+        <a:font script="Khmr" typeface="MoolBoran"/>
+        <a:font script="Knda" typeface="Tunga"/>
+        <a:font script="Guru" typeface="Raavi"/>
+        <a:font script="Cans" typeface="Euphemia"/>
+        <a:font script="Cher" typeface="Plantagenet Cherokee"/>
+        <a:font script="Yiii" typeface="Microsoft Yi Baiti"/>
+        <a:font script="Tibt" typeface="Microsoft Himalaya"/>
+        <a:font script="Thaa" typeface="MV Boli"/>
+        <a:font script="Deva" typeface="Mangal"/>
+        <a:font script="Telu" typeface="Gautami"/>
+        <a:font script="Taml" typeface="Latha"/>
+        <a:font script="Syrc" typeface="Estrangelo Edessa"/>
+        <a:font script="Orya" typeface="Kalinga"/>
+        <a:font script="Mlym" typeface="Kartika"/>
+        <a:font script="Laoo" typeface="DokChampa"/>
+        <a:font script="Sinh" typeface="Iskoola Pota"/>
+        <a:font script="Mong" typeface="Mongolian Baiti"/>
+        <a:font script="Viet" typeface="Times New Roman"/>
+        <a:font script="Uigh" typeface="Microsoft Uighur"/>
+        <a:font script="Geor" typeface="Sylfaen"/>
+        <a:font script="Armn" typeface="Arial"/>
+        <a:font script="Bugi" typeface="Leelawadee UI"/>
+        <a:font script="Bopo" typeface="Microsoft JhengHei"/>
+        <a:font script="Java" typeface="Javanese Text"/>
+        <a:font script="Lisu" typeface="Segoe UI"/>
+        <a:font script="Mymr" typeface="Myanmar Text"/>
+        <a:font script="Nkoo" typeface="Ebrima"/>
+        <a:font script="Olck" typeface="Nirmala UI"/>
+        <a:font script="Osma" typeface="Ebrima"/>
+        <a:font script="Phag" typeface="Phagspa"/>
+        <a:font script="Syrn" typeface="Estrangelo Edessa"/>
+        <a:font script="Syrj" typeface="Estrangelo Edessa"/>
+        <a:font script="Syre" typeface="Estrangelo Edessa"/>
+        <a:font script="Sora" typeface="Nirmala UI"/>
+        <a:font script="Tale" typeface="Microsoft Tai Le"/>
+        <a:font script="Talu" typeface="Microsoft New Tai Lue"/>
+        <a:font script="Tfng" typeface="Ebrima"/>
+      </a:majorFont>
+      <a:minorFont>
+        <a:latin typeface="Aptos" panose="02110004020202020204"/>
+        <a:ea typeface=""/>
+        <a:cs typeface=""/>
+        <a:font script="Jpan" typeface="游明朝"/>
+        <a:font script="Hang" typeface="맑은 고딕"/>
+        <a:font script="Hans" typeface="等线"/>
+        <a:font script="Hant" typeface="新細明體"/>
+        <a:font script="Arab" typeface="Arial"/>
+        <a:font script="Hebr" typeface="Arial"/>
+        <a:font script="Thai" typeface="Cordia New"/>
+        <a:font script="Ethi" typeface="Nyala"/>
+        <a:font script="Beng" typeface="Vrinda"/>
+        <a:font script="Gujr" typeface="Shruti"/>
+        <a:font script="Khmr" typeface="DaunPenh"/>
+        <a:font script="Knda" typeface="Tunga"/>
+        <a:font script="Guru" typeface="Raavi"/>
+        <a:font script="Cans" typeface="Euphemia"/>
+        <a:font script="Cher" typeface="Plantagenet Cherokee"/>
+        <a:font script="Yiii" typeface="Microsoft Yi Baiti"/>
+        <a:font script="Tibt" typeface="Microsoft Himalaya"/>
+        <a:font script="Thaa" typeface="MV Boli"/>
+        <a:font script="Deva" typeface="Mangal"/>
+        <a:font script="Telu" typeface="Gautami"/>
+        <a:font script="Taml" typeface="Latha"/>
+        <a:font script="Syrc" typeface="Estrangelo Edessa"/>
+        <a:font script="Orya" typeface="Kalinga"/>
+        <a:font script="Mlym" typeface="Kartika"/>
+        <a:font script="Laoo" typeface="DokChampa"/>
+        <a:font script="Sinh" typeface="Iskoola Pota"/>
+        <a:font script="Mong" typeface="Mongolian Baiti"/>
+        <a:font script="Viet" typeface="Arial"/>
+        <a:font script="Uigh" typeface="Microsoft Uighur"/>
+        <a:font script="Geor" typeface="Sylfaen"/>
+        <a:font script="Armn" typeface="Arial"/>
+        <a:font script="Bugi" typeface="Leelawadee UI"/>
+        <a:font script="Bopo" typeface="Microsoft JhengHei"/>
+        <a:font script="Java" typeface="Javanese Text"/>
+        <a:font script="Lisu" typeface="Segoe UI"/>
+        <a:font script="Mymr" typeface="Myanmar Text"/>
+        <a:font script="Nkoo" typeface="Ebrima"/>
+        <a:font script="Olck" typeface="Nirmala UI"/>
+        <a:font script="Osma" typeface="Ebrima"/>
+        <a:font script="Phag" typeface="Phagspa"/>
+        <a:font script="Syrn" typeface="Estrangelo Edessa"/>
+        <a:font script="Syrj" typeface="Estrangelo Edessa"/>
+        <a:font script="Syre" typeface="Estrangelo Edessa"/>
+        <a:font script="Sora" typeface="Nirmala UI"/>
+        <a:font script="Tale" typeface="Microsoft Tai Le"/>
+        <a:font script="Talu" typeface="Microsoft New Tai Lue"/>
+        <a:font script="Tfng" typeface="Ebrima"/>
+      </a:minorFont>
+    </a:fontScheme>
+    <a:fmtScheme name="Office">
+      <a:fillStyleLst>
+        <a:solidFill>
+          <a:schemeClr val="phClr"/>
+        </a:solidFill>
+        <a:gradFill rotWithShape="1">
+          <a:gsLst>
+            <a:gs pos="0">
+              <a:schemeClr val="phClr">
+                <a:lumMod val="110000"/>
+                <a:satMod val="105000"/>
+                <a:tint val="67000"/>
+              </a:schemeClr>
+            </a:gs>
+            <a:gs pos="50000">
+              <a:schemeClr val="phClr">
+                <a:lumMod val="105000"/>
+                <a:satMod val="103000"/>
+                <a:tint val="73000"/>
+              </a:schemeClr>
+            </a:gs>
+            <a:gs pos="100000">
+              <a:schemeClr val="phClr">
+                <a:lumMod val="105000"/>
+                <a:satMod val="109000"/>
+                <a:tint val="81000"/>
+              </a:schemeClr>
+            </a:gs>
+          </a:gsLst>
+          <a:lin ang="5400000" scaled="0"/>
+        </a:gradFill>
+        <a:gradFill rotWithShape="1">
+          <a:gsLst>
+            <a:gs pos="0">
+              <a:schemeClr val="phClr">
+                <a:satMod val="103000"/>
+                <a:lumMod val="102000"/>
+                <a:tint val="94000"/>
+              </a:schemeClr>
+            </a:gs>
+            <a:gs pos="50000">
+              <a:schemeClr val="phClr">
+                <a:satMod val="110000"/>
+                <a:lumMod val="100000"/>
+                <a:shade val="100000"/>
+              </a:schemeClr>
+            </a:gs>
+            <a:gs pos="100000">
+              <a:schemeClr val="phClr">
+                <a:lumMod val="99000"/>
+                <a:satMod val="120000"/>
+                <a:shade val="78000"/>
+              </a:schemeClr>
+            </a:gs>
+          </a:gsLst>
+          <a:lin ang="5400000" scaled="0"/>
+        </a:gradFill>
+      </a:fillStyleLst>
+      <a:lnStyleLst>
+        <a:ln w="12700" cap="flat" cmpd="sng" algn="ctr">
+          <a:solidFill>
+            <a:schemeClr val="phClr"/>
+          </a:solidFill>
+          <a:prstDash val="solid"/>
+          <a:miter lim="800000"/>
+        </a:ln>
+        <a:ln w="19050" cap="flat" cmpd="sng" algn="ctr">
+          <a:solidFill>
+            <a:schemeClr val="phClr"/>
+          </a:solidFill>
+          <a:prstDash val="solid"/>
+          <a:miter lim="800000"/>
+        </a:ln>
+        <a:ln w="25400" cap="flat" cmpd="sng" algn="ctr">
+          <a:solidFill>
+            <a:schemeClr val="phClr"/>
+          </a:solidFill>
+          <a:prstDash val="solid"/>
+          <a:miter lim="800000"/>
+        </a:ln>
+      </a:lnStyleLst>
+      <a:effectStyleLst>
+        <a:effectStyle>
+          <a:effectLst/>
+        </a:effectStyle>
+        <a:effectStyle>
+          <a:effectLst/>
+        </a:effectStyle>
+        <a:effectStyle>
+          <a:effectLst>
+            <a:outerShdw blurRad="57150" dist="19050" dir="5400000" algn="ctr" rotWithShape="0">
+              <a:srgbClr val="000000">
+                <a:alpha val="63000"/>
+              </a:srgbClr>
+            </a:outerShdw>
+          </a:effectLst>
+        </a:effectStyle>
+      </a:effectStyleLst>
+      <a:bgFillStyleLst>
+        <a:solidFill>
+          <a:schemeClr val="phClr"/>
+        </a:solidFill>
+        <a:solidFill>
+          <a:schemeClr val="phClr">
+            <a:tint val="95000"/>
+            <a:satMod val="170000"/>
+          </a:schemeClr>
+        </a:solidFill>
+        <a:gradFill rotWithShape="1">
+          <a:gsLst>
+            <a:gs pos="0">
+              <a:schemeClr val="phClr">
+                <a:tint val="93000"/>
+                <a:satMod val="150000"/>
+                <a:shade val="98000"/>
+                <a:lumMod val="102000"/>
+              </a:schemeClr>
+            </a:gs>
+            <a:gs pos="50000">
+              <a:schemeClr val="phClr">
+                <a:tint val="98000"/>
+                <a:satMod val="130000"/>
+                <a:shade val="90000"/>
+                <a:lumMod val="103000"/>
+              </a:schemeClr>
+            </a:gs>
+            <a:gs pos="100000">
+              <a:schemeClr val="phClr">
+                <a:shade val="63000"/>
+                <a:satMod val="120000"/>
+              </a:schemeClr>
+            </a:gs>
+          </a:gsLst>
+          <a:lin ang="5400000" scaled="0"/>
+        </a:gradFill>
+      </a:bgFillStyleLst>
+    </a:fmtScheme>
+  </a:themeElements>
+  <a:objectDefaults>
+    <a:lnDef>
+      <a:spPr/>
+      <a:bodyPr/>
+      <a:lstStyle/>
+      <a:style>
+        <a:lnRef idx="2">
+          <a:schemeClr val="accent1"/>
+        </a:lnRef>
+        <a:fillRef idx="0">
+          <a:schemeClr val="accent1"/>
+        </a:fillRef>
+        <a:effectRef idx="1">
+          <a:schemeClr val="accent1"/>
+        </a:effectRef>
+        <a:fontRef idx="minor">
+          <a:schemeClr val="tx1"/>
+        </a:fontRef>
+      </a:style>
+    </a:lnDef>
+  </a:objectDefaults>
+  <a:extraClrSchemeLst/>
+  <a:extLst>
+    <a:ext uri="{05A4C25C-085E-4340-85A3-A5531E510DB2}">
+      <thm15:themeFamily xmlns:thm15="http://schemas.microsoft.com/office/thememl/2012/main" name="Office Theme" id="{2E142A2C-CD16-42D6-873A-C26D2A0506FA}" vid="{1BDDFF52-6CD6-40A5-AB3C-68EB2F1E4D0A}"/>
+    </a:ext>
+  </a:extLst>
+</a:theme>
 </file>
</xml_diff>